<commit_message>
Updated the Week 2 switching behaviour lab write-up.
Include the latest revisions to the controlled LAN frame delivery submission.
</commit_message>
<xml_diff>
--- a/Week_2/Week 2 - Session 2 - Lab/Week 2 - Session 2 - Lab - Topology Modelling and Switching Behaviour- Frame Delivery in a Controlled LAN.docx
+++ b/Week_2/Week 2 - Session 2 - Lab/Week 2 - Session 2 - Lab - Topology Modelling and Switching Behaviour- Frame Delivery in a Controlled LAN.docx
@@ -1,6 +1,6 @@
 
 <file path=word/document.xml><?xml version="1.0" encoding="utf-8"?>
-<w:document xmlns:wpc="http://schemas.microsoft.com/office/word/2010/wordprocessingCanvas" xmlns:cx="http://schemas.microsoft.com/office/drawing/2014/chartex" xmlns:cx1="http://schemas.microsoft.com/office/drawing/2015/9/8/chartex" xmlns:cx2="http://schemas.microsoft.com/office/drawing/2015/10/21/chartex" xmlns:cx3="http://schemas.microsoft.com/office/drawing/2016/5/9/chartex" xmlns:cx4="http://schemas.microsoft.com/office/drawing/2016/5/10/chartex" xmlns:cx5="http://schemas.microsoft.com/office/drawing/2016/5/11/chartex" xmlns:cx6="http://schemas.microsoft.com/office/drawing/2016/5/12/chartex" xmlns:cx7="http://schemas.microsoft.com/office/drawing/2016/5/13/chartex" xmlns:cx8="http://schemas.microsoft.com/office/drawing/2016/5/14/chartex" xmlns:mc="http://schemas.openxmlformats.org/markup-compatibility/2006" xmlns:aink="http://schemas.microsoft.com/office/drawing/2016/ink" xmlns:am3d="http://schemas.microsoft.com/office/drawing/2017/model3d" xmlns:o="urn:schemas-microsoft-com:office:office" xmlns:oel="http://schemas.microsoft.com/office/2019/extlst" xmlns:r="http://schemas.openxmlformats.org/officeDocument/2006/relationships" xmlns:m="http://schemas.openxmlformats.org/officeDocument/2006/math" xmlns:v="urn:schemas-microsoft-com:vml" xmlns:wp14="http://schemas.microsoft.com/office/word/2010/wordprocessingDrawing" xmlns:wp="http://schemas.openxmlformats.org/drawingml/2006/wordprocessingDrawing" xmlns:w10="urn:schemas-microsoft-com:office:word" xmlns:w="http://schemas.openxmlformats.org/wordprocessingml/2006/main" xmlns:w14="http://schemas.microsoft.com/office/word/2010/wordml" xmlns:w15="http://schemas.microsoft.com/office/word/2012/wordml" xmlns:w16cex="http://schemas.microsoft.com/office/word/2018/wordml/cex" xmlns:w16cid="http://schemas.microsoft.com/office/word/2016/wordml/cid" xmlns:w16="http://schemas.microsoft.com/office/word/2018/wordml" xmlns:w16du="http://schemas.microsoft.com/office/word/2023/wordml/word16du" xmlns:w16sdtdh="http://schemas.microsoft.com/office/word/2020/wordml/sdtdatahash" xmlns:w16sdtfl="http://schemas.microsoft.com/office/word/2024/wordml/sdtformatlock" xmlns:w16se="http://schemas.microsoft.com/office/word/2015/wordml/symex" xmlns:wpg="http://schemas.microsoft.com/office/word/2010/wordprocessingGroup" xmlns:wpi="http://schemas.microsoft.com/office/word/2010/wordprocessingInk" xmlns:wne="http://schemas.microsoft.com/office/word/2006/wordml" xmlns:wps="http://schemas.microsoft.com/office/word/2010/wordprocessingShape" mc:Ignorable="w14 w15 w16se w16cid w16 w16cex w16sdtdh w16sdtfl w16du wp14">
+<w:document xmlns:wpc="http://schemas.microsoft.com/office/word/2010/wordprocessingCanvas" xmlns:cx="http://schemas.microsoft.com/office/drawing/2014/chartex" xmlns:cx1="http://schemas.microsoft.com/office/drawing/2015/9/8/chartex" xmlns:cx2="http://schemas.microsoft.com/office/drawing/2015/10/21/chartex" xmlns:cx3="http://schemas.microsoft.com/office/drawing/2016/5/9/chartex" xmlns:cx4="http://schemas.microsoft.com/office/drawing/2016/5/10/chartex" xmlns:cx5="http://schemas.microsoft.com/office/drawing/2016/5/11/chartex" xmlns:cx6="http://schemas.microsoft.com/office/drawing/2016/5/12/chartex" xmlns:cx7="http://schemas.microsoft.com/office/drawing/2016/5/13/chartex" xmlns:cx8="http://schemas.microsoft.com/office/drawing/2016/5/14/chartex" xmlns:mc="http://schemas.openxmlformats.org/markup-compatibility/2006" xmlns:m="http://schemas.openxmlformats.org/officeDocument/2006/math" xmlns:aink="http://schemas.microsoft.com/office/drawing/2016/ink" xmlns:am3d="http://schemas.microsoft.com/office/drawing/2017/model3d" xmlns:oel="http://schemas.microsoft.com/office/2019/extlst" xmlns:r="http://schemas.openxmlformats.org/officeDocument/2006/relationships" xmlns:wp14="http://schemas.microsoft.com/office/word/2010/wordprocessingDrawing" xmlns:wp="http://schemas.openxmlformats.org/drawingml/2006/wordprocessingDrawing" xmlns:wpg="http://schemas.microsoft.com/office/word/2010/wordprocessingGroup" xmlns:wpi="http://schemas.microsoft.com/office/word/2010/wordprocessingInk" xmlns:wps="http://schemas.microsoft.com/office/word/2010/wordprocessingShape" xmlns:o="urn:schemas-microsoft-com:office:office" xmlns:v="urn:schemas-microsoft-com:vml" xmlns:w10="urn:schemas-microsoft-com:office:word" xmlns:w="http://schemas.openxmlformats.org/wordprocessingml/2006/main" xmlns:w14="http://schemas.microsoft.com/office/word/2010/wordml" xmlns:w15="http://schemas.microsoft.com/office/word/2012/wordml" xmlns:w16cex="http://schemas.microsoft.com/office/word/2018/wordml/cex" xmlns:w16cid="http://schemas.microsoft.com/office/word/2016/wordml/cid" xmlns:w16="http://schemas.microsoft.com/office/word/2018/wordml" xmlns:w16sdtdh="http://schemas.microsoft.com/office/word/2020/wordml/sdtdatahash" xmlns:w16sdtfl="http://schemas.microsoft.com/office/word/2024/wordml/sdtformatlock" xmlns:w16se="http://schemas.microsoft.com/office/word/2015/wordml/symex" xmlns:w16du="http://schemas.microsoft.com/office/word/2023/wordml/word16du" xmlns:wne="http://schemas.microsoft.com/office/word/2006/wordml" mc:Ignorable="w14 w15 w16se w16cid w16 w16cex w16sdtdh w16sdtfl w16du wp14">
   <w:body>
     <w:p>
       <w:pPr>
@@ -3203,8 +3203,8 @@
         <w:tblLook w:val="04A0" w:firstRow="1" w:lastRow="0" w:firstColumn="1" w:lastColumn="0" w:noHBand="0" w:noVBand="1"/>
       </w:tblPr>
       <w:tblGrid>
-        <w:gridCol w:w="1383"/>
-        <w:gridCol w:w="3112"/>
+        <w:gridCol w:w="1382"/>
+        <w:gridCol w:w="3113"/>
         <w:gridCol w:w="2547"/>
         <w:gridCol w:w="2576"/>
       </w:tblGrid>
@@ -3329,6 +3329,9 @@
                 <w:szCs w:val="20"/>
               </w:rPr>
             </w:pPr>
+            <w:r>
+              <w:t>000A.41C6.C6E4</w:t>
+            </w:r>
           </w:p>
         </w:tc>
         <w:tc>
@@ -3343,6 +3346,9 @@
                 <w:szCs w:val="20"/>
               </w:rPr>
             </w:pPr>
+            <w:r>
+              <w:t>000A.41</w:t>
+            </w:r>
           </w:p>
         </w:tc>
         <w:tc>
@@ -3357,6 +3363,9 @@
                 <w:szCs w:val="20"/>
               </w:rPr>
             </w:pPr>
+            <w:r>
+              <w:t>C6.C6E4</w:t>
+            </w:r>
           </w:p>
         </w:tc>
       </w:tr>
@@ -3395,6 +3404,9 @@
                 <w:szCs w:val="20"/>
               </w:rPr>
             </w:pPr>
+            <w:r>
+              <w:t>0009.7C3B.3A97</w:t>
+            </w:r>
           </w:p>
         </w:tc>
         <w:tc>
@@ -3409,6 +3421,9 @@
                 <w:szCs w:val="20"/>
               </w:rPr>
             </w:pPr>
+            <w:r>
+              <w:t>0009.7C</w:t>
+            </w:r>
           </w:p>
         </w:tc>
         <w:tc>
@@ -3423,6 +3438,9 @@
                 <w:szCs w:val="20"/>
               </w:rPr>
             </w:pPr>
+            <w:r>
+              <w:t>3B.3A97</w:t>
+            </w:r>
           </w:p>
         </w:tc>
       </w:tr>
@@ -4006,7 +4024,33 @@
           <w:rFonts w:asciiTheme="minorBidi" w:hAnsiTheme="minorBidi"/>
           <w:sz w:val="22"/>
         </w:rPr>
-        <w:t>Answer: ________________________________________________</w:t>
+        <w:t xml:space="preserve">Answer: </w:t>
+      </w:r>
+      <w:r>
+        <w:rPr>
+          <w:rStyle w:val="HTMLCode"/>
+          <w:rFonts w:eastAsia="Calibri"/>
+        </w:rPr>
+        <w:t>0009.7c3b.3a97</w:t>
+      </w:r>
+      <w:r>
+        <w:t xml:space="preserve"> </w:t>
+      </w:r>
+      <w:r>
+        <w:rPr>
+          <w:rFonts w:ascii="Arial" w:hAnsi="Arial" w:cs="Arial"/>
+        </w:rPr>
+        <w:t>and</w:t>
+      </w:r>
+      <w:r>
+        <w:t xml:space="preserve"> </w:t>
+      </w:r>
+      <w:r>
+        <w:rPr>
+          <w:rStyle w:val="HTMLCode"/>
+          <w:rFonts w:eastAsia="Calibri"/>
+        </w:rPr>
+        <w:t>000a.41c6.c6e4</w:t>
       </w:r>
     </w:p>
     <w:p>
@@ -4039,7 +4083,48 @@
           <w:rFonts w:asciiTheme="minorBidi" w:hAnsiTheme="minorBidi"/>
           <w:sz w:val="22"/>
         </w:rPr>
-        <w:t>Answer: ________________________________________________</w:t>
+        <w:t xml:space="preserve">Answer: </w:t>
+      </w:r>
+      <w:r>
+        <w:rPr>
+          <w:rStyle w:val="HTMLCode"/>
+          <w:rFonts w:eastAsia="Calibri"/>
+        </w:rPr>
+        <w:t>000a.41c6.c6e4</w:t>
+      </w:r>
+      <w:r>
+        <w:t xml:space="preserve"> is associated with </w:t>
+      </w:r>
+      <w:r>
+        <w:rPr>
+          <w:rStyle w:val="Strong"/>
+        </w:rPr>
+        <w:t>Fa0/6</w:t>
+      </w:r>
+      <w:r>
+        <w:t>.</w:t>
+      </w:r>
+      <w:r>
+        <w:t xml:space="preserve"> </w:t>
+      </w:r>
+      <w:r>
+        <w:rPr>
+          <w:rStyle w:val="HTMLCode"/>
+          <w:rFonts w:eastAsia="Calibri"/>
+        </w:rPr>
+        <w:t>0009.7c3b.3a97</w:t>
+      </w:r>
+      <w:r>
+        <w:t xml:space="preserve"> is associated with </w:t>
+      </w:r>
+      <w:r>
+        <w:rPr>
+          <w:rStyle w:val="Strong"/>
+        </w:rPr>
+        <w:t>Fa0/1</w:t>
+      </w:r>
+      <w:r>
+        <w:t>.</w:t>
       </w:r>
     </w:p>
     <w:p>
@@ -4072,7 +4157,39 @@
           <w:rFonts w:asciiTheme="minorBidi" w:hAnsiTheme="minorBidi"/>
           <w:sz w:val="22"/>
         </w:rPr>
-        <w:t>Answer: ________________________________________________</w:t>
+        <w:t xml:space="preserve">Answer: </w:t>
+      </w:r>
+      <w:r>
+        <w:rPr>
+          <w:rFonts w:ascii="Arial" w:hAnsi="Arial" w:cs="Arial"/>
+        </w:rPr>
+        <w:t xml:space="preserve">After traffic was generated, the switch learned more MAC addresses and added them to the MAC address table. PC-A’s MAC address now appears on port </w:t>
+      </w:r>
+      <w:r>
+        <w:rPr>
+          <w:rStyle w:val="Strong"/>
+          <w:rFonts w:ascii="Arial" w:hAnsi="Arial" w:cs="Arial"/>
+        </w:rPr>
+        <w:t>Fa0/6</w:t>
+      </w:r>
+      <w:r>
+        <w:rPr>
+          <w:rFonts w:ascii="Arial" w:hAnsi="Arial" w:cs="Arial"/>
+        </w:rPr>
+        <w:t xml:space="preserve">, and PC-B’s MAC address appears through </w:t>
+      </w:r>
+      <w:r>
+        <w:rPr>
+          <w:rStyle w:val="Strong"/>
+          <w:rFonts w:ascii="Arial" w:hAnsi="Arial" w:cs="Arial"/>
+        </w:rPr>
+        <w:t>Fa0/1</w:t>
+      </w:r>
+      <w:r>
+        <w:rPr>
+          <w:rFonts w:ascii="Arial" w:hAnsi="Arial" w:cs="Arial"/>
+        </w:rPr>
+        <w:t>.</w:t>
       </w:r>
     </w:p>
     <w:p>
@@ -4094,19 +4211,69 @@
     </w:p>
     <w:p>
       <w:pPr>
+        <w:pStyle w:val="pdq2pgselectionanchorcontainer"/>
         <w:ind w:left="360"/>
         <w:rPr>
-          <w:rFonts w:asciiTheme="minorBidi" w:hAnsiTheme="minorBidi"/>
+          <w:rFonts w:ascii="Arial" w:hAnsi="Arial" w:cs="Arial"/>
+        </w:rPr>
+      </w:pPr>
+      <w:r>
+        <w:rPr>
+          <w:rFonts w:ascii="Arial" w:hAnsi="Arial" w:cs="Arial"/>
           <w:sz w:val="22"/>
         </w:rPr>
-      </w:pPr>
-      <w:r>
+        <w:t>Answer:</w:t>
+      </w:r>
+      <w:r>
+        <w:rPr>
+          <w:rFonts w:ascii="Arial" w:hAnsi="Arial" w:cs="Arial"/>
+        </w:rPr>
+        <w:t xml:space="preserve"> </w:t>
+      </w:r>
+      <w:r>
+        <w:rPr>
+          <w:rFonts w:ascii="Arial" w:hAnsi="Arial" w:cs="Arial"/>
+        </w:rPr>
+        <w:t xml:space="preserve">The switch needs this </w:t>
+      </w:r>
+      <w:proofErr w:type="gramStart"/>
+      <w:r>
+        <w:rPr>
+          <w:rFonts w:ascii="Arial" w:hAnsi="Arial" w:cs="Arial"/>
+        </w:rPr>
+        <w:t>information</w:t>
+      </w:r>
+      <w:proofErr w:type="gramEnd"/>
+      <w:r>
+        <w:rPr>
+          <w:rFonts w:ascii="Arial" w:hAnsi="Arial" w:cs="Arial"/>
+        </w:rPr>
+        <w:t xml:space="preserve"> so it knows which port to forward frames to. Instead of sending every frame to every port, it can use the MAC address table to deliver traffic to the correct device or link.</w:t>
+      </w:r>
+    </w:p>
+    <w:p>
+      <w:pPr>
+        <w:pStyle w:val="NormalWeb"/>
+        <w:ind w:left="360"/>
+        <w:rPr>
+          <w:rFonts w:ascii="Arial" w:hAnsi="Arial" w:cs="Arial"/>
+        </w:rPr>
+      </w:pPr>
+      <w:r>
+        <w:rPr>
+          <w:rFonts w:ascii="Arial" w:hAnsi="Arial" w:cs="Arial"/>
+        </w:rPr>
+        <w:t>The lab explains that switches learn source MAC addresses, link them to ports, and use that information to support local frame delivery inside the LAN.</w:t>
+      </w:r>
+    </w:p>
+    <w:p>
+      <w:pPr>
+        <w:ind w:left="360"/>
         <w:rPr>
           <w:rFonts w:asciiTheme="minorBidi" w:hAnsiTheme="minorBidi"/>
           <w:sz w:val="22"/>
         </w:rPr>
-        <w:t>Answer: ________________________________________________</w:t>
-      </w:r>
+      </w:pPr>
     </w:p>
     <w:p>
       <w:pPr>
@@ -4335,6 +4502,7 @@
         <w:rPr>
           <w:rFonts w:asciiTheme="minorBidi" w:hAnsiTheme="minorBidi"/>
         </w:rPr>
+        <w:lastRenderedPageBreak/>
         <w:t>On S2, enter the following commands:</w:t>
       </w:r>
     </w:p>
@@ -4500,7 +4668,6 @@
           <w:b/>
           <w:sz w:val="22"/>
         </w:rPr>
-        <w:lastRenderedPageBreak/>
         <w:t>What the S2 configuration is doing</w:t>
       </w:r>
     </w:p>
@@ -5073,7 +5240,48 @@
         <w:rPr>
           <w:rFonts w:asciiTheme="minorBidi" w:hAnsiTheme="minorBidi"/>
         </w:rPr>
-        <w:t>Answer: ________________________________________________</w:t>
+        <w:t xml:space="preserve">Answer: </w:t>
+      </w:r>
+      <w:r>
+        <w:rPr>
+          <w:rFonts w:ascii="Arial" w:hAnsi="Arial" w:cs="Arial"/>
+        </w:rPr>
+        <w:t xml:space="preserve">S1 learns </w:t>
+      </w:r>
+      <w:r>
+        <w:rPr>
+          <w:rStyle w:val="Strong"/>
+          <w:rFonts w:ascii="Arial" w:hAnsi="Arial" w:cs="Arial"/>
+        </w:rPr>
+        <w:t xml:space="preserve">PC-B’s MAC address </w:t>
+      </w:r>
+      <w:r>
+        <w:rPr>
+          <w:rStyle w:val="HTMLCode"/>
+          <w:rFonts w:ascii="Arial" w:eastAsia="Calibri" w:hAnsi="Arial" w:cs="Arial"/>
+          <w:b/>
+          <w:bCs/>
+        </w:rPr>
+        <w:t>0009.7c3b.3a97</w:t>
+      </w:r>
+      <w:r>
+        <w:rPr>
+          <w:rFonts w:ascii="Arial" w:hAnsi="Arial" w:cs="Arial"/>
+        </w:rPr>
+        <w:t xml:space="preserve"> through the inter-switch link, usually on </w:t>
+      </w:r>
+      <w:r>
+        <w:rPr>
+          <w:rStyle w:val="Strong"/>
+          <w:rFonts w:ascii="Arial" w:hAnsi="Arial" w:cs="Arial"/>
+        </w:rPr>
+        <w:t>Fa0/1</w:t>
+      </w:r>
+      <w:r>
+        <w:rPr>
+          <w:rFonts w:ascii="Arial" w:hAnsi="Arial" w:cs="Arial"/>
+        </w:rPr>
+        <w:t>.</w:t>
       </w:r>
     </w:p>
     <w:p>
@@ -5102,7 +5310,48 @@
         <w:rPr>
           <w:rFonts w:asciiTheme="minorBidi" w:hAnsiTheme="minorBidi"/>
         </w:rPr>
-        <w:t>Answer: ________________________________________________</w:t>
+        <w:t xml:space="preserve">Answer: </w:t>
+      </w:r>
+      <w:r>
+        <w:rPr>
+          <w:rFonts w:ascii="Arial" w:hAnsi="Arial" w:cs="Arial"/>
+        </w:rPr>
+        <w:t xml:space="preserve">S2 learns </w:t>
+      </w:r>
+      <w:r>
+        <w:rPr>
+          <w:rStyle w:val="Strong"/>
+          <w:rFonts w:ascii="Arial" w:hAnsi="Arial" w:cs="Arial"/>
+        </w:rPr>
+        <w:t xml:space="preserve">PC-A’s MAC address </w:t>
+      </w:r>
+      <w:r>
+        <w:rPr>
+          <w:rStyle w:val="HTMLCode"/>
+          <w:rFonts w:ascii="Arial" w:eastAsia="Calibri" w:hAnsi="Arial" w:cs="Arial"/>
+          <w:b/>
+          <w:bCs/>
+        </w:rPr>
+        <w:t>000a.41c6.c6e4</w:t>
+      </w:r>
+      <w:r>
+        <w:rPr>
+          <w:rFonts w:ascii="Arial" w:hAnsi="Arial" w:cs="Arial"/>
+        </w:rPr>
+        <w:t xml:space="preserve"> through the inter-switch link, usually on </w:t>
+      </w:r>
+      <w:r>
+        <w:rPr>
+          <w:rStyle w:val="Strong"/>
+          <w:rFonts w:ascii="Arial" w:hAnsi="Arial" w:cs="Arial"/>
+        </w:rPr>
+        <w:t>Fa0/1</w:t>
+      </w:r>
+      <w:r>
+        <w:rPr>
+          <w:rFonts w:ascii="Arial" w:hAnsi="Arial" w:cs="Arial"/>
+        </w:rPr>
+        <w:t>.</w:t>
       </w:r>
     </w:p>
     <w:p>
@@ -5131,7 +5380,98 @@
         <w:rPr>
           <w:rFonts w:asciiTheme="minorBidi" w:hAnsiTheme="minorBidi"/>
         </w:rPr>
-        <w:t>Answer: ________________________________________________</w:t>
+        <w:t xml:space="preserve">Answer: </w:t>
+      </w:r>
+      <w:r>
+        <w:rPr>
+          <w:rFonts w:ascii="Arial" w:hAnsi="Arial" w:cs="Arial"/>
+        </w:rPr>
+        <w:t xml:space="preserve">On </w:t>
+      </w:r>
+      <w:r>
+        <w:rPr>
+          <w:rStyle w:val="Strong"/>
+          <w:rFonts w:ascii="Arial" w:hAnsi="Arial" w:cs="Arial"/>
+        </w:rPr>
+        <w:t>S1</w:t>
+      </w:r>
+      <w:r>
+        <w:rPr>
+          <w:rFonts w:ascii="Arial" w:hAnsi="Arial" w:cs="Arial"/>
+        </w:rPr>
+        <w:t xml:space="preserve">, PC-A’s MAC address </w:t>
+      </w:r>
+      <w:r>
+        <w:rPr>
+          <w:rStyle w:val="HTMLCode"/>
+          <w:rFonts w:ascii="Arial" w:eastAsia="Calibri" w:hAnsi="Arial" w:cs="Arial"/>
+        </w:rPr>
+        <w:t>000a.41c6.c6e4</w:t>
+      </w:r>
+      <w:r>
+        <w:rPr>
+          <w:rFonts w:ascii="Arial" w:hAnsi="Arial" w:cs="Arial"/>
+        </w:rPr>
+        <w:t xml:space="preserve"> is local because PC-A is directly connected to S1, normally on </w:t>
+      </w:r>
+      <w:r>
+        <w:rPr>
+          <w:rStyle w:val="Strong"/>
+          <w:rFonts w:ascii="Arial" w:hAnsi="Arial" w:cs="Arial"/>
+        </w:rPr>
+        <w:t>Fa0/6</w:t>
+      </w:r>
+      <w:r>
+        <w:rPr>
+          <w:rFonts w:ascii="Arial" w:hAnsi="Arial" w:cs="Arial"/>
+        </w:rPr>
+        <w:t>.</w:t>
+      </w:r>
+      <w:r>
+        <w:rPr>
+          <w:rFonts w:ascii="Arial" w:hAnsi="Arial" w:cs="Arial"/>
+        </w:rPr>
+        <w:br/>
+        <w:t xml:space="preserve">On </w:t>
+      </w:r>
+      <w:r>
+        <w:rPr>
+          <w:rStyle w:val="Strong"/>
+          <w:rFonts w:ascii="Arial" w:hAnsi="Arial" w:cs="Arial"/>
+        </w:rPr>
+        <w:t>S2</w:t>
+      </w:r>
+      <w:r>
+        <w:rPr>
+          <w:rFonts w:ascii="Arial" w:hAnsi="Arial" w:cs="Arial"/>
+        </w:rPr>
+        <w:t xml:space="preserve">, PC-B’s MAC address </w:t>
+      </w:r>
+      <w:r>
+        <w:rPr>
+          <w:rStyle w:val="HTMLCode"/>
+          <w:rFonts w:ascii="Arial" w:eastAsia="Calibri" w:hAnsi="Arial" w:cs="Arial"/>
+        </w:rPr>
+        <w:t>0009.7c3b.3a97</w:t>
+      </w:r>
+      <w:r>
+        <w:rPr>
+          <w:rFonts w:ascii="Arial" w:hAnsi="Arial" w:cs="Arial"/>
+        </w:rPr>
+        <w:t xml:space="preserve"> is local because PC-B is directly connected to S2, normally on </w:t>
+      </w:r>
+      <w:r>
+        <w:rPr>
+          <w:rStyle w:val="Strong"/>
+          <w:rFonts w:ascii="Arial" w:hAnsi="Arial" w:cs="Arial"/>
+        </w:rPr>
+        <w:t>Fa0/18</w:t>
+      </w:r>
+      <w:r>
+        <w:rPr>
+          <w:rFonts w:ascii="Arial" w:hAnsi="Arial" w:cs="Arial"/>
+        </w:rPr>
+        <w:t>.</w:t>
       </w:r>
     </w:p>
     <w:p>
@@ -5151,17 +5491,59 @@
     </w:p>
     <w:p>
       <w:pPr>
+        <w:pStyle w:val="pdq2pgselectionanchorcontainer"/>
+        <w:rPr>
+          <w:rFonts w:ascii="Arial" w:hAnsi="Arial" w:cs="Arial"/>
+        </w:rPr>
+      </w:pPr>
+      <w:r>
+        <w:rPr>
+          <w:rFonts w:asciiTheme="minorBidi" w:hAnsiTheme="minorBidi"/>
+        </w:rPr>
+        <w:lastRenderedPageBreak/>
+        <w:t xml:space="preserve">Answer: </w:t>
+      </w:r>
+      <w:r>
+        <w:rPr>
+          <w:rFonts w:ascii="Arial" w:hAnsi="Arial" w:cs="Arial"/>
+        </w:rPr>
+        <w:t>The inter-switch link allows each switch to learn about devices connected to the other switch. S1 learns that PC-B is reachable through the link to S2, and S2 learns that PC-A is reachable through the link to S1. This helps the switches forward frames to the correct path instead of flooding traffic unnecessarily.</w:t>
+      </w:r>
+    </w:p>
+    <w:p>
+      <w:pPr>
+        <w:pStyle w:val="NormalWeb"/>
+        <w:rPr>
+          <w:rFonts w:ascii="Arial" w:hAnsi="Arial" w:cs="Arial"/>
+        </w:rPr>
+      </w:pPr>
+      <w:r>
+        <w:rPr>
+          <w:rFonts w:ascii="Arial" w:hAnsi="Arial" w:cs="Arial"/>
+        </w:rPr>
+        <w:t xml:space="preserve">The lab explains that in the extended topology, S1 and S2 should both be checked with </w:t>
+      </w:r>
+      <w:r>
+        <w:rPr>
+          <w:rStyle w:val="HTMLCode"/>
+          <w:rFonts w:ascii="Arial" w:hAnsi="Arial" w:cs="Arial"/>
+        </w:rPr>
+        <w:t>show mac address-table</w:t>
+      </w:r>
+      <w:r>
+        <w:rPr>
+          <w:rFonts w:ascii="Arial" w:hAnsi="Arial" w:cs="Arial"/>
+        </w:rPr>
+        <w:t xml:space="preserve"> so you can compare how each switch learns local MAC addresses and MAC addresses reachable through the inter-switch link.</w:t>
+      </w:r>
+    </w:p>
+    <w:p>
+      <w:pPr>
         <w:ind w:left="360"/>
         <w:rPr>
           <w:rFonts w:asciiTheme="minorBidi" w:hAnsiTheme="minorBidi"/>
         </w:rPr>
       </w:pPr>
-      <w:r>
-        <w:rPr>
-          <w:rFonts w:asciiTheme="minorBidi" w:hAnsiTheme="minorBidi"/>
-        </w:rPr>
-        <w:t>Answer: ________________________________________________</w:t>
-      </w:r>
     </w:p>
     <w:p>
       <w:pPr>
@@ -5234,7 +5616,52 @@
         <w:rPr>
           <w:rFonts w:asciiTheme="minorBidi" w:hAnsiTheme="minorBidi"/>
         </w:rPr>
-        <w:t>Answer: ________________________________________________</w:t>
+        <w:t xml:space="preserve">Answer: </w:t>
+      </w:r>
+      <w:r>
+        <w:rPr>
+          <w:rFonts w:ascii="Arial" w:hAnsi="Arial" w:cs="Arial"/>
+        </w:rPr>
+        <w:t xml:space="preserve">PC-A is connected to </w:t>
+      </w:r>
+      <w:r>
+        <w:rPr>
+          <w:rStyle w:val="Strong"/>
+          <w:rFonts w:ascii="Arial" w:hAnsi="Arial" w:cs="Arial"/>
+        </w:rPr>
+        <w:t>S1</w:t>
+      </w:r>
+      <w:r>
+        <w:rPr>
+          <w:rFonts w:ascii="Arial" w:hAnsi="Arial" w:cs="Arial"/>
+        </w:rPr>
+        <w:t xml:space="preserve">, S1 is connected to </w:t>
+      </w:r>
+      <w:r>
+        <w:rPr>
+          <w:rStyle w:val="Strong"/>
+          <w:rFonts w:ascii="Arial" w:hAnsi="Arial" w:cs="Arial"/>
+        </w:rPr>
+        <w:t>S2</w:t>
+      </w:r>
+      <w:r>
+        <w:rPr>
+          <w:rFonts w:ascii="Arial" w:hAnsi="Arial" w:cs="Arial"/>
+        </w:rPr>
+        <w:t xml:space="preserve"> using the inter-switch link, and PC-B is connected to </w:t>
+      </w:r>
+      <w:r>
+        <w:rPr>
+          <w:rStyle w:val="Strong"/>
+          <w:rFonts w:ascii="Arial" w:hAnsi="Arial" w:cs="Arial"/>
+        </w:rPr>
+        <w:t>S2</w:t>
+      </w:r>
+      <w:r>
+        <w:rPr>
+          <w:rFonts w:ascii="Arial" w:hAnsi="Arial" w:cs="Arial"/>
+        </w:rPr>
+        <w:t>. Both PCs and switches are in the same local network, using the 192.168.1.0/24 address range.</w:t>
       </w:r>
     </w:p>
     <w:p>
@@ -5253,30 +5680,63 @@
     </w:p>
     <w:p>
       <w:pPr>
-        <w:rPr>
-          <w:rFonts w:asciiTheme="minorBidi" w:hAnsiTheme="minorBidi"/>
-        </w:rPr>
-      </w:pPr>
-      <w:r>
-        <w:rPr>
-          <w:rFonts w:asciiTheme="minorBidi" w:hAnsiTheme="minorBidi"/>
-        </w:rPr>
-        <w:t>Answer: ________________________________________________</w:t>
+        <w:pStyle w:val="pdq2pgselectionanchorcontainer"/>
+        <w:rPr>
+          <w:rFonts w:ascii="Arial" w:hAnsi="Arial" w:cs="Arial"/>
+          <w:sz w:val="21"/>
+          <w:szCs w:val="21"/>
+        </w:rPr>
+      </w:pPr>
+      <w:r>
+        <w:rPr>
+          <w:rFonts w:asciiTheme="minorBidi" w:hAnsiTheme="minorBidi"/>
+          <w:sz w:val="21"/>
+          <w:szCs w:val="21"/>
+        </w:rPr>
+        <w:t xml:space="preserve">Answer: </w:t>
+      </w:r>
+      <w:r>
+        <w:rPr>
+          <w:rFonts w:ascii="Arial" w:hAnsi="Arial" w:cs="Arial"/>
+          <w:sz w:val="21"/>
+          <w:szCs w:val="21"/>
+        </w:rPr>
+        <w:t xml:space="preserve">Traffic from PC-A travels from </w:t>
+      </w:r>
+      <w:r>
+        <w:rPr>
+          <w:rStyle w:val="Strong"/>
+          <w:rFonts w:ascii="Arial" w:hAnsi="Arial" w:cs="Arial"/>
+          <w:sz w:val="21"/>
+          <w:szCs w:val="21"/>
+        </w:rPr>
+        <w:t>PC-A → S1 → inter-switch link → S2 → PC-B</w:t>
+      </w:r>
+      <w:r>
+        <w:rPr>
+          <w:rFonts w:ascii="Arial" w:hAnsi="Arial" w:cs="Arial"/>
+          <w:sz w:val="21"/>
+          <w:szCs w:val="21"/>
+        </w:rPr>
+        <w:t>. The switches use their MAC address tables to forward the frames toward the correct device instead of sending traffic randomly.</w:t>
       </w:r>
     </w:p>
     <w:p>
       <w:pPr>
-        <w:rPr>
-          <w:rFonts w:asciiTheme="minorBidi" w:hAnsiTheme="minorBidi"/>
-          <w:b/>
-        </w:rPr>
-      </w:pPr>
-      <w:r>
-        <w:rPr>
-          <w:rFonts w:asciiTheme="minorBidi" w:hAnsiTheme="minorBidi"/>
-          <w:b/>
-        </w:rPr>
-        <w:br w:type="page"/>
+        <w:pStyle w:val="NormalWeb"/>
+        <w:rPr>
+          <w:rFonts w:ascii="Arial" w:hAnsi="Arial" w:cs="Arial"/>
+          <w:sz w:val="21"/>
+          <w:szCs w:val="21"/>
+        </w:rPr>
+      </w:pPr>
+      <w:r>
+        <w:rPr>
+          <w:rFonts w:ascii="Arial" w:hAnsi="Arial" w:cs="Arial"/>
+          <w:sz w:val="21"/>
+          <w:szCs w:val="21"/>
+        </w:rPr>
+        <w:t>This matches the lab’s extended topology, where PC-A remains on S1, PC-B is moved to S2, and S1 connects to S2 through an inter-switch link.</w:t>
       </w:r>
     </w:p>
     <w:p>
@@ -5285,6 +5745,28 @@
           <w:rFonts w:asciiTheme="minorBidi" w:hAnsiTheme="minorBidi"/>
         </w:rPr>
       </w:pPr>
+    </w:p>
+    <w:p>
+      <w:pPr>
+        <w:rPr>
+          <w:rFonts w:asciiTheme="minorBidi" w:hAnsiTheme="minorBidi"/>
+          <w:b/>
+        </w:rPr>
+      </w:pPr>
+      <w:r>
+        <w:rPr>
+          <w:rFonts w:asciiTheme="minorBidi" w:hAnsiTheme="minorBidi"/>
+          <w:b/>
+        </w:rPr>
+        <w:br w:type="page"/>
+      </w:r>
+    </w:p>
+    <w:p>
+      <w:pPr>
+        <w:rPr>
+          <w:rFonts w:asciiTheme="minorBidi" w:hAnsiTheme="minorBidi"/>
+        </w:rPr>
+      </w:pPr>
       <w:r>
         <w:rPr>
           <w:rFonts w:asciiTheme="minorBidi" w:hAnsiTheme="minorBidi"/>
@@ -5304,7 +5786,20 @@
         <w:rPr>
           <w:rFonts w:asciiTheme="minorBidi" w:hAnsiTheme="minorBidi"/>
         </w:rPr>
-        <w:t>Answer: ________________________________________________</w:t>
+        <w:t xml:space="preserve">Answer: </w:t>
+      </w:r>
+      <w:r>
+        <w:t xml:space="preserve">The evidence is the output from </w:t>
+      </w:r>
+      <w:r>
+        <w:rPr>
+          <w:rStyle w:val="HTMLCode"/>
+          <w:rFonts w:eastAsia="Calibri"/>
+        </w:rPr>
+        <w:t>show mac address-table</w:t>
+      </w:r>
+      <w:r>
+        <w:t>, because it shows each learned MAC address and the switch port where that device or path is located.</w:t>
       </w:r>
     </w:p>
     <w:p>
@@ -5331,7 +5826,13 @@
         <w:rPr>
           <w:rFonts w:asciiTheme="minorBidi" w:hAnsiTheme="minorBidi"/>
         </w:rPr>
-        <w:t>Answer: ________________________________________________</w:t>
+        <w:t xml:space="preserve">Answer: </w:t>
+      </w:r>
+      <w:r>
+        <w:rPr>
+          <w:rFonts w:ascii="Arial" w:hAnsi="Arial" w:cs="Arial"/>
+        </w:rPr>
+        <w:t>PC-A and PC-B would no longer be able to communicate with each other because the connection between S1 and S2 would be broken. Each switch would only be able to reach devices connected locally to itself.</w:t>
       </w:r>
     </w:p>
     <w:p>
@@ -5358,7 +5859,39 @@
         <w:rPr>
           <w:rFonts w:asciiTheme="minorBidi" w:hAnsiTheme="minorBidi"/>
         </w:rPr>
-        <w:t>Answer: ________________________________________________</w:t>
+        <w:t xml:space="preserve">Answer: </w:t>
+      </w:r>
+      <w:r>
+        <w:rPr>
+          <w:rFonts w:ascii="Arial" w:hAnsi="Arial" w:cs="Arial"/>
+        </w:rPr>
+        <w:t xml:space="preserve">If </w:t>
+      </w:r>
+      <w:r>
+        <w:rPr>
+          <w:rStyle w:val="Strong"/>
+          <w:rFonts w:ascii="Arial" w:hAnsi="Arial" w:cs="Arial"/>
+        </w:rPr>
+        <w:t>S1 failed</w:t>
+      </w:r>
+      <w:r>
+        <w:rPr>
+          <w:rFonts w:ascii="Arial" w:hAnsi="Arial" w:cs="Arial"/>
+        </w:rPr>
+        <w:t xml:space="preserve">, PC-A would lose its connection to the LAN, and communication to PC-B through S2 would fail. If </w:t>
+      </w:r>
+      <w:r>
+        <w:rPr>
+          <w:rStyle w:val="Strong"/>
+          <w:rFonts w:ascii="Arial" w:hAnsi="Arial" w:cs="Arial"/>
+        </w:rPr>
+        <w:t>S2 failed</w:t>
+      </w:r>
+      <w:r>
+        <w:rPr>
+          <w:rFonts w:ascii="Arial" w:hAnsi="Arial" w:cs="Arial"/>
+        </w:rPr>
+        <w:t>, PC-B would lose its connection to the LAN, and communication from PC-A to PC-B would fail.</w:t>
       </w:r>
     </w:p>
     <w:p>
@@ -5522,16 +6055,54 @@
     </w:p>
     <w:p>
       <w:pPr>
-        <w:rPr>
-          <w:rFonts w:asciiTheme="minorBidi" w:hAnsiTheme="minorBidi"/>
-        </w:rPr>
-      </w:pPr>
-      <w:r>
-        <w:rPr>
-          <w:rFonts w:asciiTheme="minorBidi" w:hAnsiTheme="minorBidi"/>
-        </w:rPr>
-        <w:t>Answer: ________________________________________________</w:t>
-      </w:r>
+        <w:pStyle w:val="pdq2pgselectionanchorcontainer"/>
+        <w:rPr>
+          <w:rFonts w:ascii="Arial" w:hAnsi="Arial" w:cs="Arial"/>
+          <w:sz w:val="21"/>
+          <w:szCs w:val="21"/>
+        </w:rPr>
+      </w:pPr>
+      <w:r>
+        <w:rPr>
+          <w:rFonts w:asciiTheme="minorBidi" w:hAnsiTheme="minorBidi"/>
+          <w:sz w:val="21"/>
+          <w:szCs w:val="21"/>
+        </w:rPr>
+        <w:t xml:space="preserve">Answer: </w:t>
+      </w:r>
+      <w:r>
+        <w:rPr>
+          <w:rFonts w:ascii="Arial" w:hAnsi="Arial" w:cs="Arial"/>
+          <w:sz w:val="21"/>
+          <w:szCs w:val="21"/>
+        </w:rPr>
+        <w:t>Simulation Mode shows the step-by-step movement of packets/frames through the network. It helps show the source and destination MAC addresses, the path through the switches, and how frames are forwarded, which a simple ping result does not show.</w:t>
+      </w:r>
+    </w:p>
+    <w:p>
+      <w:pPr>
+        <w:pStyle w:val="NormalWeb"/>
+        <w:rPr>
+          <w:rFonts w:ascii="Arial" w:hAnsi="Arial" w:cs="Arial"/>
+          <w:sz w:val="21"/>
+          <w:szCs w:val="21"/>
+        </w:rPr>
+      </w:pPr>
+      <w:r>
+        <w:rPr>
+          <w:rFonts w:ascii="Arial" w:hAnsi="Arial" w:cs="Arial"/>
+          <w:sz w:val="21"/>
+          <w:szCs w:val="21"/>
+        </w:rPr>
+        <w:t>The lab’s key idea is that a switch learns source MAC addresses, links them to ports, and uses that information to support local frame delivery inside the LAN.</w:t>
+      </w:r>
+    </w:p>
+    <w:p>
+      <w:pPr>
+        <w:rPr>
+          <w:rFonts w:asciiTheme="minorBidi" w:hAnsiTheme="minorBidi"/>
+        </w:rPr>
+      </w:pPr>
     </w:p>
     <w:p>
       <w:pPr>
@@ -5720,7 +6291,25 @@
                 <w:sz w:val="20"/>
                 <w:szCs w:val="20"/>
               </w:rPr>
-              <w:t>[   ]</w:t>
+              <w:t>[</w:t>
+            </w:r>
+            <w:r>
+              <w:rPr>
+                <w:rFonts w:ascii="Segoe UI Symbol" w:hAnsi="Segoe UI Symbol" w:cs="Segoe UI Symbol"/>
+                <w:color w:val="000000"/>
+                <w:sz w:val="39"/>
+                <w:szCs w:val="39"/>
+                <w:shd w:val="clear" w:color="auto" w:fill="B3FFB3"/>
+              </w:rPr>
+              <w:t>✓</w:t>
+            </w:r>
+            <w:r>
+              <w:rPr>
+                <w:rFonts w:asciiTheme="minorBidi" w:hAnsiTheme="minorBidi"/>
+                <w:sz w:val="20"/>
+                <w:szCs w:val="20"/>
+              </w:rPr>
+              <w:t>]</w:t>
             </w:r>
           </w:p>
         </w:tc>
@@ -5783,7 +6372,25 @@
                 <w:sz w:val="20"/>
                 <w:szCs w:val="20"/>
               </w:rPr>
-              <w:t>[   ]</w:t>
+              <w:t>[</w:t>
+            </w:r>
+            <w:r>
+              <w:rPr>
+                <w:rFonts w:ascii="Segoe UI Emoji" w:hAnsi="Segoe UI Emoji"/>
+                <w:color w:val="000000"/>
+                <w:sz w:val="39"/>
+                <w:szCs w:val="39"/>
+                <w:shd w:val="clear" w:color="auto" w:fill="B3FFB3"/>
+              </w:rPr>
+              <w:t>✓</w:t>
+            </w:r>
+            <w:r>
+              <w:rPr>
+                <w:rFonts w:asciiTheme="minorBidi" w:hAnsiTheme="minorBidi"/>
+                <w:sz w:val="20"/>
+                <w:szCs w:val="20"/>
+              </w:rPr>
+              <w:t>]</w:t>
             </w:r>
           </w:p>
         </w:tc>
@@ -5846,7 +6453,25 @@
                 <w:sz w:val="20"/>
                 <w:szCs w:val="20"/>
               </w:rPr>
-              <w:t>[   ]</w:t>
+              <w:t>[</w:t>
+            </w:r>
+            <w:r>
+              <w:rPr>
+                <w:rFonts w:ascii="Segoe UI Emoji" w:hAnsi="Segoe UI Emoji"/>
+                <w:color w:val="000000"/>
+                <w:sz w:val="39"/>
+                <w:szCs w:val="39"/>
+                <w:shd w:val="clear" w:color="auto" w:fill="B3FFB3"/>
+              </w:rPr>
+              <w:t>✓</w:t>
+            </w:r>
+            <w:r>
+              <w:rPr>
+                <w:rFonts w:asciiTheme="minorBidi" w:hAnsiTheme="minorBidi"/>
+                <w:sz w:val="20"/>
+                <w:szCs w:val="20"/>
+              </w:rPr>
+              <w:t>]</w:t>
             </w:r>
           </w:p>
         </w:tc>
@@ -5909,7 +6534,25 @@
                 <w:sz w:val="20"/>
                 <w:szCs w:val="20"/>
               </w:rPr>
-              <w:t>[   ]</w:t>
+              <w:t>[</w:t>
+            </w:r>
+            <w:r>
+              <w:rPr>
+                <w:rFonts w:ascii="Segoe UI Emoji" w:hAnsi="Segoe UI Emoji"/>
+                <w:color w:val="000000"/>
+                <w:sz w:val="39"/>
+                <w:szCs w:val="39"/>
+                <w:shd w:val="clear" w:color="auto" w:fill="B3FFB3"/>
+              </w:rPr>
+              <w:t>✓</w:t>
+            </w:r>
+            <w:r>
+              <w:rPr>
+                <w:rFonts w:asciiTheme="minorBidi" w:hAnsiTheme="minorBidi"/>
+                <w:sz w:val="20"/>
+                <w:szCs w:val="20"/>
+              </w:rPr>
+              <w:t>]</w:t>
             </w:r>
           </w:p>
         </w:tc>
@@ -5990,7 +6633,25 @@
                 <w:sz w:val="20"/>
                 <w:szCs w:val="20"/>
               </w:rPr>
-              <w:t>[   ]</w:t>
+              <w:t>[</w:t>
+            </w:r>
+            <w:r>
+              <w:rPr>
+                <w:rFonts w:ascii="Segoe UI Emoji" w:hAnsi="Segoe UI Emoji"/>
+                <w:color w:val="000000"/>
+                <w:sz w:val="39"/>
+                <w:szCs w:val="39"/>
+                <w:shd w:val="clear" w:color="auto" w:fill="B3FFB3"/>
+              </w:rPr>
+              <w:t>✓</w:t>
+            </w:r>
+            <w:r>
+              <w:rPr>
+                <w:rFonts w:asciiTheme="minorBidi" w:hAnsiTheme="minorBidi"/>
+                <w:sz w:val="20"/>
+                <w:szCs w:val="20"/>
+              </w:rPr>
+              <w:t>]</w:t>
             </w:r>
           </w:p>
         </w:tc>
@@ -6053,7 +6714,25 @@
                 <w:sz w:val="20"/>
                 <w:szCs w:val="20"/>
               </w:rPr>
-              <w:t>[   ]</w:t>
+              <w:t>[</w:t>
+            </w:r>
+            <w:r>
+              <w:rPr>
+                <w:rFonts w:ascii="Segoe UI Emoji" w:hAnsi="Segoe UI Emoji"/>
+                <w:color w:val="000000"/>
+                <w:sz w:val="39"/>
+                <w:szCs w:val="39"/>
+                <w:shd w:val="clear" w:color="auto" w:fill="B3FFB3"/>
+              </w:rPr>
+              <w:t>✓</w:t>
+            </w:r>
+            <w:r>
+              <w:rPr>
+                <w:rFonts w:asciiTheme="minorBidi" w:hAnsiTheme="minorBidi"/>
+                <w:sz w:val="20"/>
+                <w:szCs w:val="20"/>
+              </w:rPr>
+              <w:t>]</w:t>
             </w:r>
           </w:p>
         </w:tc>
@@ -6116,7 +6795,25 @@
                 <w:sz w:val="20"/>
                 <w:szCs w:val="20"/>
               </w:rPr>
-              <w:t>[   ]</w:t>
+              <w:t>[</w:t>
+            </w:r>
+            <w:r>
+              <w:rPr>
+                <w:rFonts w:ascii="Segoe UI Emoji" w:hAnsi="Segoe UI Emoji"/>
+                <w:color w:val="000000"/>
+                <w:sz w:val="39"/>
+                <w:szCs w:val="39"/>
+                <w:shd w:val="clear" w:color="auto" w:fill="B3FFB3"/>
+              </w:rPr>
+              <w:t>✓</w:t>
+            </w:r>
+            <w:r>
+              <w:rPr>
+                <w:rFonts w:asciiTheme="minorBidi" w:hAnsiTheme="minorBidi"/>
+                <w:sz w:val="20"/>
+                <w:szCs w:val="20"/>
+              </w:rPr>
+              <w:t>]</w:t>
             </w:r>
           </w:p>
         </w:tc>
@@ -6179,7 +6876,25 @@
                 <w:sz w:val="20"/>
                 <w:szCs w:val="20"/>
               </w:rPr>
-              <w:t>[   ]</w:t>
+              <w:t>[</w:t>
+            </w:r>
+            <w:r>
+              <w:rPr>
+                <w:rFonts w:ascii="Segoe UI Emoji" w:hAnsi="Segoe UI Emoji"/>
+                <w:color w:val="000000"/>
+                <w:sz w:val="39"/>
+                <w:szCs w:val="39"/>
+                <w:shd w:val="clear" w:color="auto" w:fill="B3FFB3"/>
+              </w:rPr>
+              <w:t>✓</w:t>
+            </w:r>
+            <w:r>
+              <w:rPr>
+                <w:rFonts w:asciiTheme="minorBidi" w:hAnsiTheme="minorBidi"/>
+                <w:sz w:val="20"/>
+                <w:szCs w:val="20"/>
+              </w:rPr>
+              <w:t>]</w:t>
             </w:r>
           </w:p>
         </w:tc>
@@ -6242,7 +6957,25 @@
                 <w:sz w:val="20"/>
                 <w:szCs w:val="20"/>
               </w:rPr>
-              <w:t>[   ]</w:t>
+              <w:t>[</w:t>
+            </w:r>
+            <w:r>
+              <w:rPr>
+                <w:rFonts w:ascii="Segoe UI Emoji" w:hAnsi="Segoe UI Emoji"/>
+                <w:color w:val="000000"/>
+                <w:sz w:val="39"/>
+                <w:szCs w:val="39"/>
+                <w:shd w:val="clear" w:color="auto" w:fill="B3FFB3"/>
+              </w:rPr>
+              <w:t>✓</w:t>
+            </w:r>
+            <w:r>
+              <w:rPr>
+                <w:rFonts w:asciiTheme="minorBidi" w:hAnsiTheme="minorBidi"/>
+                <w:sz w:val="20"/>
+                <w:szCs w:val="20"/>
+              </w:rPr>
+              <w:t>]</w:t>
             </w:r>
           </w:p>
         </w:tc>
@@ -6484,7 +7217,7 @@
 </file>
 
 <file path=word/endnotes.xml><?xml version="1.0" encoding="utf-8"?>
-<w:endnotes xmlns:wpc="http://schemas.microsoft.com/office/word/2010/wordprocessingCanvas" xmlns:cx="http://schemas.microsoft.com/office/drawing/2014/chartex" xmlns:cx1="http://schemas.microsoft.com/office/drawing/2015/9/8/chartex" xmlns:cx2="http://schemas.microsoft.com/office/drawing/2015/10/21/chartex" xmlns:cx3="http://schemas.microsoft.com/office/drawing/2016/5/9/chartex" xmlns:cx4="http://schemas.microsoft.com/office/drawing/2016/5/10/chartex" xmlns:cx5="http://schemas.microsoft.com/office/drawing/2016/5/11/chartex" xmlns:cx6="http://schemas.microsoft.com/office/drawing/2016/5/12/chartex" xmlns:cx7="http://schemas.microsoft.com/office/drawing/2016/5/13/chartex" xmlns:cx8="http://schemas.microsoft.com/office/drawing/2016/5/14/chartex" xmlns:mc="http://schemas.openxmlformats.org/markup-compatibility/2006" xmlns:aink="http://schemas.microsoft.com/office/drawing/2016/ink" xmlns:am3d="http://schemas.microsoft.com/office/drawing/2017/model3d" xmlns:o="urn:schemas-microsoft-com:office:office" xmlns:oel="http://schemas.microsoft.com/office/2019/extlst" xmlns:r="http://schemas.openxmlformats.org/officeDocument/2006/relationships" xmlns:m="http://schemas.openxmlformats.org/officeDocument/2006/math" xmlns:v="urn:schemas-microsoft-com:vml" xmlns:wp14="http://schemas.microsoft.com/office/word/2010/wordprocessingDrawing" xmlns:wp="http://schemas.openxmlformats.org/drawingml/2006/wordprocessingDrawing" xmlns:w10="urn:schemas-microsoft-com:office:word" xmlns:w="http://schemas.openxmlformats.org/wordprocessingml/2006/main" xmlns:w14="http://schemas.microsoft.com/office/word/2010/wordml" xmlns:w15="http://schemas.microsoft.com/office/word/2012/wordml" xmlns:w16cex="http://schemas.microsoft.com/office/word/2018/wordml/cex" xmlns:w16cid="http://schemas.microsoft.com/office/word/2016/wordml/cid" xmlns:w16="http://schemas.microsoft.com/office/word/2018/wordml" xmlns:w16du="http://schemas.microsoft.com/office/word/2023/wordml/word16du" xmlns:w16sdtdh="http://schemas.microsoft.com/office/word/2020/wordml/sdtdatahash" xmlns:w16sdtfl="http://schemas.microsoft.com/office/word/2024/wordml/sdtformatlock" xmlns:w16se="http://schemas.microsoft.com/office/word/2015/wordml/symex" xmlns:wpg="http://schemas.microsoft.com/office/word/2010/wordprocessingGroup" xmlns:wpi="http://schemas.microsoft.com/office/word/2010/wordprocessingInk" xmlns:wne="http://schemas.microsoft.com/office/word/2006/wordml" xmlns:wps="http://schemas.microsoft.com/office/word/2010/wordprocessingShape" mc:Ignorable="w14 w15 w16se w16cid w16 w16cex w16sdtdh w16sdtfl w16du wp14">
+<w:endnotes xmlns:wpc="http://schemas.microsoft.com/office/word/2010/wordprocessingCanvas" xmlns:cx="http://schemas.microsoft.com/office/drawing/2014/chartex" xmlns:cx1="http://schemas.microsoft.com/office/drawing/2015/9/8/chartex" xmlns:cx2="http://schemas.microsoft.com/office/drawing/2015/10/21/chartex" xmlns:cx3="http://schemas.microsoft.com/office/drawing/2016/5/9/chartex" xmlns:cx4="http://schemas.microsoft.com/office/drawing/2016/5/10/chartex" xmlns:cx5="http://schemas.microsoft.com/office/drawing/2016/5/11/chartex" xmlns:cx6="http://schemas.microsoft.com/office/drawing/2016/5/12/chartex" xmlns:cx7="http://schemas.microsoft.com/office/drawing/2016/5/13/chartex" xmlns:cx8="http://schemas.microsoft.com/office/drawing/2016/5/14/chartex" xmlns:mc="http://schemas.openxmlformats.org/markup-compatibility/2006" xmlns:m="http://schemas.openxmlformats.org/officeDocument/2006/math" xmlns:aink="http://schemas.microsoft.com/office/drawing/2016/ink" xmlns:am3d="http://schemas.microsoft.com/office/drawing/2017/model3d" xmlns:oel="http://schemas.microsoft.com/office/2019/extlst" xmlns:r="http://schemas.openxmlformats.org/officeDocument/2006/relationships" xmlns:wp14="http://schemas.microsoft.com/office/word/2010/wordprocessingDrawing" xmlns:wp="http://schemas.openxmlformats.org/drawingml/2006/wordprocessingDrawing" xmlns:wpg="http://schemas.microsoft.com/office/word/2010/wordprocessingGroup" xmlns:wpi="http://schemas.microsoft.com/office/word/2010/wordprocessingInk" xmlns:wps="http://schemas.microsoft.com/office/word/2010/wordprocessingShape" xmlns:o="urn:schemas-microsoft-com:office:office" xmlns:v="urn:schemas-microsoft-com:vml" xmlns:w10="urn:schemas-microsoft-com:office:word" xmlns:w="http://schemas.openxmlformats.org/wordprocessingml/2006/main" xmlns:w14="http://schemas.microsoft.com/office/word/2010/wordml" xmlns:w15="http://schemas.microsoft.com/office/word/2012/wordml" xmlns:w16cex="http://schemas.microsoft.com/office/word/2018/wordml/cex" xmlns:w16cid="http://schemas.microsoft.com/office/word/2016/wordml/cid" xmlns:w16="http://schemas.microsoft.com/office/word/2018/wordml" xmlns:w16sdtdh="http://schemas.microsoft.com/office/word/2020/wordml/sdtdatahash" xmlns:w16sdtfl="http://schemas.microsoft.com/office/word/2024/wordml/sdtformatlock" xmlns:w16se="http://schemas.microsoft.com/office/word/2015/wordml/symex" xmlns:w16du="http://schemas.microsoft.com/office/word/2023/wordml/word16du" xmlns:wne="http://schemas.microsoft.com/office/word/2006/wordml" mc:Ignorable="w14 w15 w16se w16cid w16 w16cex w16sdtdh w16sdtfl w16du wp14">
   <w:endnote w:type="separator" w:id="-1">
     <w:p>
       <w:pPr>
@@ -6509,7 +7242,7 @@
 </file>
 
 <file path=word/footer1.xml><?xml version="1.0" encoding="utf-8"?>
-<w:ftr xmlns:wpc="http://schemas.microsoft.com/office/word/2010/wordprocessingCanvas" xmlns:cx="http://schemas.microsoft.com/office/drawing/2014/chartex" xmlns:cx1="http://schemas.microsoft.com/office/drawing/2015/9/8/chartex" xmlns:cx2="http://schemas.microsoft.com/office/drawing/2015/10/21/chartex" xmlns:cx3="http://schemas.microsoft.com/office/drawing/2016/5/9/chartex" xmlns:cx4="http://schemas.microsoft.com/office/drawing/2016/5/10/chartex" xmlns:cx5="http://schemas.microsoft.com/office/drawing/2016/5/11/chartex" xmlns:cx6="http://schemas.microsoft.com/office/drawing/2016/5/12/chartex" xmlns:cx7="http://schemas.microsoft.com/office/drawing/2016/5/13/chartex" xmlns:cx8="http://schemas.microsoft.com/office/drawing/2016/5/14/chartex" xmlns:mc="http://schemas.openxmlformats.org/markup-compatibility/2006" xmlns:aink="http://schemas.microsoft.com/office/drawing/2016/ink" xmlns:am3d="http://schemas.microsoft.com/office/drawing/2017/model3d" xmlns:o="urn:schemas-microsoft-com:office:office" xmlns:oel="http://schemas.microsoft.com/office/2019/extlst" xmlns:r="http://schemas.openxmlformats.org/officeDocument/2006/relationships" xmlns:m="http://schemas.openxmlformats.org/officeDocument/2006/math" xmlns:v="urn:schemas-microsoft-com:vml" xmlns:wp14="http://schemas.microsoft.com/office/word/2010/wordprocessingDrawing" xmlns:wp="http://schemas.openxmlformats.org/drawingml/2006/wordprocessingDrawing" xmlns:w10="urn:schemas-microsoft-com:office:word" xmlns:w="http://schemas.openxmlformats.org/wordprocessingml/2006/main" xmlns:w14="http://schemas.microsoft.com/office/word/2010/wordml" xmlns:w15="http://schemas.microsoft.com/office/word/2012/wordml" xmlns:w16cex="http://schemas.microsoft.com/office/word/2018/wordml/cex" xmlns:w16cid="http://schemas.microsoft.com/office/word/2016/wordml/cid" xmlns:w16="http://schemas.microsoft.com/office/word/2018/wordml" xmlns:w16du="http://schemas.microsoft.com/office/word/2023/wordml/word16du" xmlns:w16sdtdh="http://schemas.microsoft.com/office/word/2020/wordml/sdtdatahash" xmlns:w16sdtfl="http://schemas.microsoft.com/office/word/2024/wordml/sdtformatlock" xmlns:w16se="http://schemas.microsoft.com/office/word/2015/wordml/symex" xmlns:wpg="http://schemas.microsoft.com/office/word/2010/wordprocessingGroup" xmlns:wpi="http://schemas.microsoft.com/office/word/2010/wordprocessingInk" xmlns:wne="http://schemas.microsoft.com/office/word/2006/wordml" xmlns:wps="http://schemas.microsoft.com/office/word/2010/wordprocessingShape" mc:Ignorable="w14 w15 w16se w16cid w16 w16cex w16sdtdh w16sdtfl w16du wp14">
+<w:ftr xmlns:wpc="http://schemas.microsoft.com/office/word/2010/wordprocessingCanvas" xmlns:cx="http://schemas.microsoft.com/office/drawing/2014/chartex" xmlns:cx1="http://schemas.microsoft.com/office/drawing/2015/9/8/chartex" xmlns:cx2="http://schemas.microsoft.com/office/drawing/2015/10/21/chartex" xmlns:cx3="http://schemas.microsoft.com/office/drawing/2016/5/9/chartex" xmlns:cx4="http://schemas.microsoft.com/office/drawing/2016/5/10/chartex" xmlns:cx5="http://schemas.microsoft.com/office/drawing/2016/5/11/chartex" xmlns:cx6="http://schemas.microsoft.com/office/drawing/2016/5/12/chartex" xmlns:cx7="http://schemas.microsoft.com/office/drawing/2016/5/13/chartex" xmlns:cx8="http://schemas.microsoft.com/office/drawing/2016/5/14/chartex" xmlns:mc="http://schemas.openxmlformats.org/markup-compatibility/2006" xmlns:m="http://schemas.openxmlformats.org/officeDocument/2006/math" xmlns:aink="http://schemas.microsoft.com/office/drawing/2016/ink" xmlns:am3d="http://schemas.microsoft.com/office/drawing/2017/model3d" xmlns:oel="http://schemas.microsoft.com/office/2019/extlst" xmlns:r="http://schemas.openxmlformats.org/officeDocument/2006/relationships" xmlns:wp14="http://schemas.microsoft.com/office/word/2010/wordprocessingDrawing" xmlns:wp="http://schemas.openxmlformats.org/drawingml/2006/wordprocessingDrawing" xmlns:wpg="http://schemas.microsoft.com/office/word/2010/wordprocessingGroup" xmlns:wpi="http://schemas.microsoft.com/office/word/2010/wordprocessingInk" xmlns:wps="http://schemas.microsoft.com/office/word/2010/wordprocessingShape" xmlns:o="urn:schemas-microsoft-com:office:office" xmlns:v="urn:schemas-microsoft-com:vml" xmlns:w10="urn:schemas-microsoft-com:office:word" xmlns:w="http://schemas.openxmlformats.org/wordprocessingml/2006/main" xmlns:w14="http://schemas.microsoft.com/office/word/2010/wordml" xmlns:w15="http://schemas.microsoft.com/office/word/2012/wordml" xmlns:w16cex="http://schemas.microsoft.com/office/word/2018/wordml/cex" xmlns:w16cid="http://schemas.microsoft.com/office/word/2016/wordml/cid" xmlns:w16="http://schemas.microsoft.com/office/word/2018/wordml" xmlns:w16sdtdh="http://schemas.microsoft.com/office/word/2020/wordml/sdtdatahash" xmlns:w16sdtfl="http://schemas.microsoft.com/office/word/2024/wordml/sdtformatlock" xmlns:w16se="http://schemas.microsoft.com/office/word/2015/wordml/symex" xmlns:w16du="http://schemas.microsoft.com/office/word/2023/wordml/word16du" xmlns:wne="http://schemas.microsoft.com/office/word/2006/wordml" mc:Ignorable="w14 w15 w16se w16cid w16 w16cex w16sdtdh w16sdtfl w16du wp14">
   <w:sdt>
     <w:sdtPr>
       <w:rPr>
@@ -6521,11 +7254,6 @@
         <w:docPartUnique/>
       </w:docPartObj>
     </w:sdtPr>
-    <w:sdtEndPr>
-      <w:rPr>
-        <w:rStyle w:val="PageNumber"/>
-      </w:rPr>
-    </w:sdtEndPr>
     <w:sdtContent>
       <w:p>
         <w:pPr>
@@ -6571,7 +7299,7 @@
 </file>
 
 <file path=word/footer2.xml><?xml version="1.0" encoding="utf-8"?>
-<w:ftr xmlns:wpc="http://schemas.microsoft.com/office/word/2010/wordprocessingCanvas" xmlns:cx="http://schemas.microsoft.com/office/drawing/2014/chartex" xmlns:cx1="http://schemas.microsoft.com/office/drawing/2015/9/8/chartex" xmlns:cx2="http://schemas.microsoft.com/office/drawing/2015/10/21/chartex" xmlns:cx3="http://schemas.microsoft.com/office/drawing/2016/5/9/chartex" xmlns:cx4="http://schemas.microsoft.com/office/drawing/2016/5/10/chartex" xmlns:cx5="http://schemas.microsoft.com/office/drawing/2016/5/11/chartex" xmlns:cx6="http://schemas.microsoft.com/office/drawing/2016/5/12/chartex" xmlns:cx7="http://schemas.microsoft.com/office/drawing/2016/5/13/chartex" xmlns:cx8="http://schemas.microsoft.com/office/drawing/2016/5/14/chartex" xmlns:mc="http://schemas.openxmlformats.org/markup-compatibility/2006" xmlns:aink="http://schemas.microsoft.com/office/drawing/2016/ink" xmlns:am3d="http://schemas.microsoft.com/office/drawing/2017/model3d" xmlns:o="urn:schemas-microsoft-com:office:office" xmlns:oel="http://schemas.microsoft.com/office/2019/extlst" xmlns:r="http://schemas.openxmlformats.org/officeDocument/2006/relationships" xmlns:m="http://schemas.openxmlformats.org/officeDocument/2006/math" xmlns:v="urn:schemas-microsoft-com:vml" xmlns:wp14="http://schemas.microsoft.com/office/word/2010/wordprocessingDrawing" xmlns:wp="http://schemas.openxmlformats.org/drawingml/2006/wordprocessingDrawing" xmlns:w10="urn:schemas-microsoft-com:office:word" xmlns:w="http://schemas.openxmlformats.org/wordprocessingml/2006/main" xmlns:w14="http://schemas.microsoft.com/office/word/2010/wordml" xmlns:w15="http://schemas.microsoft.com/office/word/2012/wordml" xmlns:w16cex="http://schemas.microsoft.com/office/word/2018/wordml/cex" xmlns:w16cid="http://schemas.microsoft.com/office/word/2016/wordml/cid" xmlns:w16="http://schemas.microsoft.com/office/word/2018/wordml" xmlns:w16du="http://schemas.microsoft.com/office/word/2023/wordml/word16du" xmlns:w16sdtdh="http://schemas.microsoft.com/office/word/2020/wordml/sdtdatahash" xmlns:w16sdtfl="http://schemas.microsoft.com/office/word/2024/wordml/sdtformatlock" xmlns:w16se="http://schemas.microsoft.com/office/word/2015/wordml/symex" xmlns:wpg="http://schemas.microsoft.com/office/word/2010/wordprocessingGroup" xmlns:wpi="http://schemas.microsoft.com/office/word/2010/wordprocessingInk" xmlns:wne="http://schemas.microsoft.com/office/word/2006/wordml" xmlns:wps="http://schemas.microsoft.com/office/word/2010/wordprocessingShape" mc:Ignorable="w14 w15 w16se w16cid w16 w16cex w16sdtdh w16sdtfl w16du wp14">
+<w:ftr xmlns:wpc="http://schemas.microsoft.com/office/word/2010/wordprocessingCanvas" xmlns:cx="http://schemas.microsoft.com/office/drawing/2014/chartex" xmlns:cx1="http://schemas.microsoft.com/office/drawing/2015/9/8/chartex" xmlns:cx2="http://schemas.microsoft.com/office/drawing/2015/10/21/chartex" xmlns:cx3="http://schemas.microsoft.com/office/drawing/2016/5/9/chartex" xmlns:cx4="http://schemas.microsoft.com/office/drawing/2016/5/10/chartex" xmlns:cx5="http://schemas.microsoft.com/office/drawing/2016/5/11/chartex" xmlns:cx6="http://schemas.microsoft.com/office/drawing/2016/5/12/chartex" xmlns:cx7="http://schemas.microsoft.com/office/drawing/2016/5/13/chartex" xmlns:cx8="http://schemas.microsoft.com/office/drawing/2016/5/14/chartex" xmlns:mc="http://schemas.openxmlformats.org/markup-compatibility/2006" xmlns:m="http://schemas.openxmlformats.org/officeDocument/2006/math" xmlns:aink="http://schemas.microsoft.com/office/drawing/2016/ink" xmlns:am3d="http://schemas.microsoft.com/office/drawing/2017/model3d" xmlns:oel="http://schemas.microsoft.com/office/2019/extlst" xmlns:r="http://schemas.openxmlformats.org/officeDocument/2006/relationships" xmlns:wp14="http://schemas.microsoft.com/office/word/2010/wordprocessingDrawing" xmlns:wp="http://schemas.openxmlformats.org/drawingml/2006/wordprocessingDrawing" xmlns:wpg="http://schemas.microsoft.com/office/word/2010/wordprocessingGroup" xmlns:wpi="http://schemas.microsoft.com/office/word/2010/wordprocessingInk" xmlns:wps="http://schemas.microsoft.com/office/word/2010/wordprocessingShape" xmlns:o="urn:schemas-microsoft-com:office:office" xmlns:v="urn:schemas-microsoft-com:vml" xmlns:w10="urn:schemas-microsoft-com:office:word" xmlns:w="http://schemas.openxmlformats.org/wordprocessingml/2006/main" xmlns:w14="http://schemas.microsoft.com/office/word/2010/wordml" xmlns:w15="http://schemas.microsoft.com/office/word/2012/wordml" xmlns:w16cex="http://schemas.microsoft.com/office/word/2018/wordml/cex" xmlns:w16cid="http://schemas.microsoft.com/office/word/2016/wordml/cid" xmlns:w16="http://schemas.microsoft.com/office/word/2018/wordml" xmlns:w16sdtdh="http://schemas.microsoft.com/office/word/2020/wordml/sdtdatahash" xmlns:w16sdtfl="http://schemas.microsoft.com/office/word/2024/wordml/sdtformatlock" xmlns:w16se="http://schemas.microsoft.com/office/word/2015/wordml/symex" xmlns:w16du="http://schemas.microsoft.com/office/word/2023/wordml/word16du" xmlns:wne="http://schemas.microsoft.com/office/word/2006/wordml" mc:Ignorable="w14 w15 w16se w16cid w16 w16cex w16sdtdh w16sdtfl w16du wp14">
   <w:sdt>
     <w:sdtPr>
       <w:rPr>
@@ -6583,11 +7311,6 @@
         <w:docPartUnique/>
       </w:docPartObj>
     </w:sdtPr>
-    <w:sdtEndPr>
-      <w:rPr>
-        <w:rStyle w:val="PageNumber"/>
-      </w:rPr>
-    </w:sdtEndPr>
     <w:sdtContent>
       <w:p>
         <w:pPr>
@@ -6640,7 +7363,7 @@
 </file>
 
 <file path=word/footnotes.xml><?xml version="1.0" encoding="utf-8"?>
-<w:footnotes xmlns:wpc="http://schemas.microsoft.com/office/word/2010/wordprocessingCanvas" xmlns:cx="http://schemas.microsoft.com/office/drawing/2014/chartex" xmlns:cx1="http://schemas.microsoft.com/office/drawing/2015/9/8/chartex" xmlns:cx2="http://schemas.microsoft.com/office/drawing/2015/10/21/chartex" xmlns:cx3="http://schemas.microsoft.com/office/drawing/2016/5/9/chartex" xmlns:cx4="http://schemas.microsoft.com/office/drawing/2016/5/10/chartex" xmlns:cx5="http://schemas.microsoft.com/office/drawing/2016/5/11/chartex" xmlns:cx6="http://schemas.microsoft.com/office/drawing/2016/5/12/chartex" xmlns:cx7="http://schemas.microsoft.com/office/drawing/2016/5/13/chartex" xmlns:cx8="http://schemas.microsoft.com/office/drawing/2016/5/14/chartex" xmlns:mc="http://schemas.openxmlformats.org/markup-compatibility/2006" xmlns:aink="http://schemas.microsoft.com/office/drawing/2016/ink" xmlns:am3d="http://schemas.microsoft.com/office/drawing/2017/model3d" xmlns:o="urn:schemas-microsoft-com:office:office" xmlns:oel="http://schemas.microsoft.com/office/2019/extlst" xmlns:r="http://schemas.openxmlformats.org/officeDocument/2006/relationships" xmlns:m="http://schemas.openxmlformats.org/officeDocument/2006/math" xmlns:v="urn:schemas-microsoft-com:vml" xmlns:wp14="http://schemas.microsoft.com/office/word/2010/wordprocessingDrawing" xmlns:wp="http://schemas.openxmlformats.org/drawingml/2006/wordprocessingDrawing" xmlns:w10="urn:schemas-microsoft-com:office:word" xmlns:w="http://schemas.openxmlformats.org/wordprocessingml/2006/main" xmlns:w14="http://schemas.microsoft.com/office/word/2010/wordml" xmlns:w15="http://schemas.microsoft.com/office/word/2012/wordml" xmlns:w16cex="http://schemas.microsoft.com/office/word/2018/wordml/cex" xmlns:w16cid="http://schemas.microsoft.com/office/word/2016/wordml/cid" xmlns:w16="http://schemas.microsoft.com/office/word/2018/wordml" xmlns:w16du="http://schemas.microsoft.com/office/word/2023/wordml/word16du" xmlns:w16sdtdh="http://schemas.microsoft.com/office/word/2020/wordml/sdtdatahash" xmlns:w16sdtfl="http://schemas.microsoft.com/office/word/2024/wordml/sdtformatlock" xmlns:w16se="http://schemas.microsoft.com/office/word/2015/wordml/symex" xmlns:wpg="http://schemas.microsoft.com/office/word/2010/wordprocessingGroup" xmlns:wpi="http://schemas.microsoft.com/office/word/2010/wordprocessingInk" xmlns:wne="http://schemas.microsoft.com/office/word/2006/wordml" xmlns:wps="http://schemas.microsoft.com/office/word/2010/wordprocessingShape" mc:Ignorable="w14 w15 w16se w16cid w16 w16cex w16sdtdh w16sdtfl w16du wp14">
+<w:footnotes xmlns:wpc="http://schemas.microsoft.com/office/word/2010/wordprocessingCanvas" xmlns:cx="http://schemas.microsoft.com/office/drawing/2014/chartex" xmlns:cx1="http://schemas.microsoft.com/office/drawing/2015/9/8/chartex" xmlns:cx2="http://schemas.microsoft.com/office/drawing/2015/10/21/chartex" xmlns:cx3="http://schemas.microsoft.com/office/drawing/2016/5/9/chartex" xmlns:cx4="http://schemas.microsoft.com/office/drawing/2016/5/10/chartex" xmlns:cx5="http://schemas.microsoft.com/office/drawing/2016/5/11/chartex" xmlns:cx6="http://schemas.microsoft.com/office/drawing/2016/5/12/chartex" xmlns:cx7="http://schemas.microsoft.com/office/drawing/2016/5/13/chartex" xmlns:cx8="http://schemas.microsoft.com/office/drawing/2016/5/14/chartex" xmlns:mc="http://schemas.openxmlformats.org/markup-compatibility/2006" xmlns:m="http://schemas.openxmlformats.org/officeDocument/2006/math" xmlns:aink="http://schemas.microsoft.com/office/drawing/2016/ink" xmlns:am3d="http://schemas.microsoft.com/office/drawing/2017/model3d" xmlns:oel="http://schemas.microsoft.com/office/2019/extlst" xmlns:r="http://schemas.openxmlformats.org/officeDocument/2006/relationships" xmlns:wp14="http://schemas.microsoft.com/office/word/2010/wordprocessingDrawing" xmlns:wp="http://schemas.openxmlformats.org/drawingml/2006/wordprocessingDrawing" xmlns:wpg="http://schemas.microsoft.com/office/word/2010/wordprocessingGroup" xmlns:wpi="http://schemas.microsoft.com/office/word/2010/wordprocessingInk" xmlns:wps="http://schemas.microsoft.com/office/word/2010/wordprocessingShape" xmlns:o="urn:schemas-microsoft-com:office:office" xmlns:v="urn:schemas-microsoft-com:vml" xmlns:w10="urn:schemas-microsoft-com:office:word" xmlns:w="http://schemas.openxmlformats.org/wordprocessingml/2006/main" xmlns:w14="http://schemas.microsoft.com/office/word/2010/wordml" xmlns:w15="http://schemas.microsoft.com/office/word/2012/wordml" xmlns:w16cex="http://schemas.microsoft.com/office/word/2018/wordml/cex" xmlns:w16cid="http://schemas.microsoft.com/office/word/2016/wordml/cid" xmlns:w16="http://schemas.microsoft.com/office/word/2018/wordml" xmlns:w16sdtdh="http://schemas.microsoft.com/office/word/2020/wordml/sdtdatahash" xmlns:w16sdtfl="http://schemas.microsoft.com/office/word/2024/wordml/sdtformatlock" xmlns:w16se="http://schemas.microsoft.com/office/word/2015/wordml/symex" xmlns:w16du="http://schemas.microsoft.com/office/word/2023/wordml/word16du" xmlns:wne="http://schemas.microsoft.com/office/word/2006/wordml" mc:Ignorable="w14 w15 w16se w16cid w16 w16cex w16sdtdh w16sdtfl w16du wp14">
   <w:footnote w:type="separator" w:id="-1">
     <w:p>
       <w:pPr>
@@ -6665,7 +7388,7 @@
 </file>
 
 <file path=word/header1.xml><?xml version="1.0" encoding="utf-8"?>
-<w:hdr xmlns:wpc="http://schemas.microsoft.com/office/word/2010/wordprocessingCanvas" xmlns:cx="http://schemas.microsoft.com/office/drawing/2014/chartex" xmlns:cx1="http://schemas.microsoft.com/office/drawing/2015/9/8/chartex" xmlns:cx2="http://schemas.microsoft.com/office/drawing/2015/10/21/chartex" xmlns:cx3="http://schemas.microsoft.com/office/drawing/2016/5/9/chartex" xmlns:cx4="http://schemas.microsoft.com/office/drawing/2016/5/10/chartex" xmlns:cx5="http://schemas.microsoft.com/office/drawing/2016/5/11/chartex" xmlns:cx6="http://schemas.microsoft.com/office/drawing/2016/5/12/chartex" xmlns:cx7="http://schemas.microsoft.com/office/drawing/2016/5/13/chartex" xmlns:cx8="http://schemas.microsoft.com/office/drawing/2016/5/14/chartex" xmlns:mc="http://schemas.openxmlformats.org/markup-compatibility/2006" xmlns:aink="http://schemas.microsoft.com/office/drawing/2016/ink" xmlns:am3d="http://schemas.microsoft.com/office/drawing/2017/model3d" xmlns:o="urn:schemas-microsoft-com:office:office" xmlns:oel="http://schemas.microsoft.com/office/2019/extlst" xmlns:r="http://schemas.openxmlformats.org/officeDocument/2006/relationships" xmlns:m="http://schemas.openxmlformats.org/officeDocument/2006/math" xmlns:v="urn:schemas-microsoft-com:vml" xmlns:wp14="http://schemas.microsoft.com/office/word/2010/wordprocessingDrawing" xmlns:wp="http://schemas.openxmlformats.org/drawingml/2006/wordprocessingDrawing" xmlns:w10="urn:schemas-microsoft-com:office:word" xmlns:w="http://schemas.openxmlformats.org/wordprocessingml/2006/main" xmlns:w14="http://schemas.microsoft.com/office/word/2010/wordml" xmlns:w15="http://schemas.microsoft.com/office/word/2012/wordml" xmlns:w16cex="http://schemas.microsoft.com/office/word/2018/wordml/cex" xmlns:w16cid="http://schemas.microsoft.com/office/word/2016/wordml/cid" xmlns:w16="http://schemas.microsoft.com/office/word/2018/wordml" xmlns:w16du="http://schemas.microsoft.com/office/word/2023/wordml/word16du" xmlns:w16sdtdh="http://schemas.microsoft.com/office/word/2020/wordml/sdtdatahash" xmlns:w16sdtfl="http://schemas.microsoft.com/office/word/2024/wordml/sdtformatlock" xmlns:w16se="http://schemas.microsoft.com/office/word/2015/wordml/symex" xmlns:wpg="http://schemas.microsoft.com/office/word/2010/wordprocessingGroup" xmlns:wpi="http://schemas.microsoft.com/office/word/2010/wordprocessingInk" xmlns:wne="http://schemas.microsoft.com/office/word/2006/wordml" xmlns:wps="http://schemas.microsoft.com/office/word/2010/wordprocessingShape" mc:Ignorable="w14 w15 w16se w16cid w16 w16cex w16sdtdh w16sdtfl w16du wp14">
+<w:hdr xmlns:wpc="http://schemas.microsoft.com/office/word/2010/wordprocessingCanvas" xmlns:cx="http://schemas.microsoft.com/office/drawing/2014/chartex" xmlns:cx1="http://schemas.microsoft.com/office/drawing/2015/9/8/chartex" xmlns:cx2="http://schemas.microsoft.com/office/drawing/2015/10/21/chartex" xmlns:cx3="http://schemas.microsoft.com/office/drawing/2016/5/9/chartex" xmlns:cx4="http://schemas.microsoft.com/office/drawing/2016/5/10/chartex" xmlns:cx5="http://schemas.microsoft.com/office/drawing/2016/5/11/chartex" xmlns:cx6="http://schemas.microsoft.com/office/drawing/2016/5/12/chartex" xmlns:cx7="http://schemas.microsoft.com/office/drawing/2016/5/13/chartex" xmlns:cx8="http://schemas.microsoft.com/office/drawing/2016/5/14/chartex" xmlns:mc="http://schemas.openxmlformats.org/markup-compatibility/2006" xmlns:m="http://schemas.openxmlformats.org/officeDocument/2006/math" xmlns:aink="http://schemas.microsoft.com/office/drawing/2016/ink" xmlns:am3d="http://schemas.microsoft.com/office/drawing/2017/model3d" xmlns:oel="http://schemas.microsoft.com/office/2019/extlst" xmlns:r="http://schemas.openxmlformats.org/officeDocument/2006/relationships" xmlns:wp14="http://schemas.microsoft.com/office/word/2010/wordprocessingDrawing" xmlns:wp="http://schemas.openxmlformats.org/drawingml/2006/wordprocessingDrawing" xmlns:wpg="http://schemas.microsoft.com/office/word/2010/wordprocessingGroup" xmlns:wpi="http://schemas.microsoft.com/office/word/2010/wordprocessingInk" xmlns:wps="http://schemas.microsoft.com/office/word/2010/wordprocessingShape" xmlns:o="urn:schemas-microsoft-com:office:office" xmlns:v="urn:schemas-microsoft-com:vml" xmlns:w10="urn:schemas-microsoft-com:office:word" xmlns:w="http://schemas.openxmlformats.org/wordprocessingml/2006/main" xmlns:w14="http://schemas.microsoft.com/office/word/2010/wordml" xmlns:w15="http://schemas.microsoft.com/office/word/2012/wordml" xmlns:w16cex="http://schemas.microsoft.com/office/word/2018/wordml/cex" xmlns:w16cid="http://schemas.microsoft.com/office/word/2016/wordml/cid" xmlns:w16="http://schemas.microsoft.com/office/word/2018/wordml" xmlns:w16sdtdh="http://schemas.microsoft.com/office/word/2020/wordml/sdtdatahash" xmlns:w16sdtfl="http://schemas.microsoft.com/office/word/2024/wordml/sdtformatlock" xmlns:w16se="http://schemas.microsoft.com/office/word/2015/wordml/symex" xmlns:w16du="http://schemas.microsoft.com/office/word/2023/wordml/word16du" xmlns:wne="http://schemas.microsoft.com/office/word/2006/wordml" mc:Ignorable="w14 w15 w16se w16cid w16 w16cex w16sdtdh w16sdtfl w16du wp14">
   <w:sdt>
     <w:sdtPr>
       <w:rPr>
@@ -6677,11 +7400,6 @@
         <w:docPartUnique/>
       </w:docPartObj>
     </w:sdtPr>
-    <w:sdtEndPr>
-      <w:rPr>
-        <w:rStyle w:val="PageNumber"/>
-      </w:rPr>
-    </w:sdtEndPr>
     <w:sdtContent>
       <w:p>
         <w:pPr>
@@ -6727,7 +7445,7 @@
 </file>
 
 <file path=word/header2.xml><?xml version="1.0" encoding="utf-8"?>
-<w:hdr xmlns:wpc="http://schemas.microsoft.com/office/word/2010/wordprocessingCanvas" xmlns:cx="http://schemas.microsoft.com/office/drawing/2014/chartex" xmlns:cx1="http://schemas.microsoft.com/office/drawing/2015/9/8/chartex" xmlns:cx2="http://schemas.microsoft.com/office/drawing/2015/10/21/chartex" xmlns:cx3="http://schemas.microsoft.com/office/drawing/2016/5/9/chartex" xmlns:cx4="http://schemas.microsoft.com/office/drawing/2016/5/10/chartex" xmlns:cx5="http://schemas.microsoft.com/office/drawing/2016/5/11/chartex" xmlns:cx6="http://schemas.microsoft.com/office/drawing/2016/5/12/chartex" xmlns:cx7="http://schemas.microsoft.com/office/drawing/2016/5/13/chartex" xmlns:cx8="http://schemas.microsoft.com/office/drawing/2016/5/14/chartex" xmlns:mc="http://schemas.openxmlformats.org/markup-compatibility/2006" xmlns:aink="http://schemas.microsoft.com/office/drawing/2016/ink" xmlns:am3d="http://schemas.microsoft.com/office/drawing/2017/model3d" xmlns:o="urn:schemas-microsoft-com:office:office" xmlns:oel="http://schemas.microsoft.com/office/2019/extlst" xmlns:r="http://schemas.openxmlformats.org/officeDocument/2006/relationships" xmlns:m="http://schemas.openxmlformats.org/officeDocument/2006/math" xmlns:v="urn:schemas-microsoft-com:vml" xmlns:wp14="http://schemas.microsoft.com/office/word/2010/wordprocessingDrawing" xmlns:wp="http://schemas.openxmlformats.org/drawingml/2006/wordprocessingDrawing" xmlns:w10="urn:schemas-microsoft-com:office:word" xmlns:w="http://schemas.openxmlformats.org/wordprocessingml/2006/main" xmlns:w14="http://schemas.microsoft.com/office/word/2010/wordml" xmlns:w15="http://schemas.microsoft.com/office/word/2012/wordml" xmlns:w16cex="http://schemas.microsoft.com/office/word/2018/wordml/cex" xmlns:w16cid="http://schemas.microsoft.com/office/word/2016/wordml/cid" xmlns:w16="http://schemas.microsoft.com/office/word/2018/wordml" xmlns:w16du="http://schemas.microsoft.com/office/word/2023/wordml/word16du" xmlns:w16sdtdh="http://schemas.microsoft.com/office/word/2020/wordml/sdtdatahash" xmlns:w16sdtfl="http://schemas.microsoft.com/office/word/2024/wordml/sdtformatlock" xmlns:w16se="http://schemas.microsoft.com/office/word/2015/wordml/symex" xmlns:wpg="http://schemas.microsoft.com/office/word/2010/wordprocessingGroup" xmlns:wpi="http://schemas.microsoft.com/office/word/2010/wordprocessingInk" xmlns:wne="http://schemas.microsoft.com/office/word/2006/wordml" xmlns:wps="http://schemas.microsoft.com/office/word/2010/wordprocessingShape" mc:Ignorable="w14 w15 w16se w16cid w16 w16cex w16sdtdh w16sdtfl w16du wp14">
+<w:hdr xmlns:wpc="http://schemas.microsoft.com/office/word/2010/wordprocessingCanvas" xmlns:cx="http://schemas.microsoft.com/office/drawing/2014/chartex" xmlns:cx1="http://schemas.microsoft.com/office/drawing/2015/9/8/chartex" xmlns:cx2="http://schemas.microsoft.com/office/drawing/2015/10/21/chartex" xmlns:cx3="http://schemas.microsoft.com/office/drawing/2016/5/9/chartex" xmlns:cx4="http://schemas.microsoft.com/office/drawing/2016/5/10/chartex" xmlns:cx5="http://schemas.microsoft.com/office/drawing/2016/5/11/chartex" xmlns:cx6="http://schemas.microsoft.com/office/drawing/2016/5/12/chartex" xmlns:cx7="http://schemas.microsoft.com/office/drawing/2016/5/13/chartex" xmlns:cx8="http://schemas.microsoft.com/office/drawing/2016/5/14/chartex" xmlns:mc="http://schemas.openxmlformats.org/markup-compatibility/2006" xmlns:m="http://schemas.openxmlformats.org/officeDocument/2006/math" xmlns:aink="http://schemas.microsoft.com/office/drawing/2016/ink" xmlns:am3d="http://schemas.microsoft.com/office/drawing/2017/model3d" xmlns:oel="http://schemas.microsoft.com/office/2019/extlst" xmlns:r="http://schemas.openxmlformats.org/officeDocument/2006/relationships" xmlns:wp14="http://schemas.microsoft.com/office/word/2010/wordprocessingDrawing" xmlns:wp="http://schemas.openxmlformats.org/drawingml/2006/wordprocessingDrawing" xmlns:wpg="http://schemas.microsoft.com/office/word/2010/wordprocessingGroup" xmlns:wpi="http://schemas.microsoft.com/office/word/2010/wordprocessingInk" xmlns:wps="http://schemas.microsoft.com/office/word/2010/wordprocessingShape" xmlns:o="urn:schemas-microsoft-com:office:office" xmlns:v="urn:schemas-microsoft-com:vml" xmlns:w10="urn:schemas-microsoft-com:office:word" xmlns:w="http://schemas.openxmlformats.org/wordprocessingml/2006/main" xmlns:w14="http://schemas.microsoft.com/office/word/2010/wordml" xmlns:w15="http://schemas.microsoft.com/office/word/2012/wordml" xmlns:w16cex="http://schemas.microsoft.com/office/word/2018/wordml/cex" xmlns:w16cid="http://schemas.microsoft.com/office/word/2016/wordml/cid" xmlns:w16="http://schemas.microsoft.com/office/word/2018/wordml" xmlns:w16sdtdh="http://schemas.microsoft.com/office/word/2020/wordml/sdtdatahash" xmlns:w16sdtfl="http://schemas.microsoft.com/office/word/2024/wordml/sdtformatlock" xmlns:w16se="http://schemas.microsoft.com/office/word/2015/wordml/symex" xmlns:w16du="http://schemas.microsoft.com/office/word/2023/wordml/word16du" xmlns:wne="http://schemas.microsoft.com/office/word/2006/wordml" mc:Ignorable="w14 w15 w16se w16cid w16 w16cex w16sdtdh w16sdtfl w16du wp14">
   <w:p>
     <w:pPr>
       <w:pStyle w:val="Header"/>
@@ -6746,7 +7464,7 @@
 </file>
 
 <file path=word/numbering.xml><?xml version="1.0" encoding="utf-8"?>
-<w:numbering xmlns:wpc="http://schemas.microsoft.com/office/word/2010/wordprocessingCanvas" xmlns:cx="http://schemas.microsoft.com/office/drawing/2014/chartex" xmlns:cx1="http://schemas.microsoft.com/office/drawing/2015/9/8/chartex" xmlns:cx2="http://schemas.microsoft.com/office/drawing/2015/10/21/chartex" xmlns:cx3="http://schemas.microsoft.com/office/drawing/2016/5/9/chartex" xmlns:cx4="http://schemas.microsoft.com/office/drawing/2016/5/10/chartex" xmlns:cx5="http://schemas.microsoft.com/office/drawing/2016/5/11/chartex" xmlns:cx6="http://schemas.microsoft.com/office/drawing/2016/5/12/chartex" xmlns:cx7="http://schemas.microsoft.com/office/drawing/2016/5/13/chartex" xmlns:cx8="http://schemas.microsoft.com/office/drawing/2016/5/14/chartex" xmlns:mc="http://schemas.openxmlformats.org/markup-compatibility/2006" xmlns:aink="http://schemas.microsoft.com/office/drawing/2016/ink" xmlns:am3d="http://schemas.microsoft.com/office/drawing/2017/model3d" xmlns:o="urn:schemas-microsoft-com:office:office" xmlns:oel="http://schemas.microsoft.com/office/2019/extlst" xmlns:r="http://schemas.openxmlformats.org/officeDocument/2006/relationships" xmlns:m="http://schemas.openxmlformats.org/officeDocument/2006/math" xmlns:v="urn:schemas-microsoft-com:vml" xmlns:wp14="http://schemas.microsoft.com/office/word/2010/wordprocessingDrawing" xmlns:wp="http://schemas.openxmlformats.org/drawingml/2006/wordprocessingDrawing" xmlns:w10="urn:schemas-microsoft-com:office:word" xmlns:w="http://schemas.openxmlformats.org/wordprocessingml/2006/main" xmlns:w14="http://schemas.microsoft.com/office/word/2010/wordml" xmlns:w15="http://schemas.microsoft.com/office/word/2012/wordml" xmlns:w16cex="http://schemas.microsoft.com/office/word/2018/wordml/cex" xmlns:w16cid="http://schemas.microsoft.com/office/word/2016/wordml/cid" xmlns:w16="http://schemas.microsoft.com/office/word/2018/wordml" xmlns:w16du="http://schemas.microsoft.com/office/word/2023/wordml/word16du" xmlns:w16sdtdh="http://schemas.microsoft.com/office/word/2020/wordml/sdtdatahash" xmlns:w16sdtfl="http://schemas.microsoft.com/office/word/2024/wordml/sdtformatlock" xmlns:w16se="http://schemas.microsoft.com/office/word/2015/wordml/symex" xmlns:wpg="http://schemas.microsoft.com/office/word/2010/wordprocessingGroup" xmlns:wpi="http://schemas.microsoft.com/office/word/2010/wordprocessingInk" xmlns:wne="http://schemas.microsoft.com/office/word/2006/wordml" xmlns:wps="http://schemas.microsoft.com/office/word/2010/wordprocessingShape" mc:Ignorable="w14 w15 w16se w16cid w16 w16cex w16sdtdh w16sdtfl w16du wp14">
+<w:numbering xmlns:wpc="http://schemas.microsoft.com/office/word/2010/wordprocessingCanvas" xmlns:cx="http://schemas.microsoft.com/office/drawing/2014/chartex" xmlns:cx1="http://schemas.microsoft.com/office/drawing/2015/9/8/chartex" xmlns:cx2="http://schemas.microsoft.com/office/drawing/2015/10/21/chartex" xmlns:cx3="http://schemas.microsoft.com/office/drawing/2016/5/9/chartex" xmlns:cx4="http://schemas.microsoft.com/office/drawing/2016/5/10/chartex" xmlns:cx5="http://schemas.microsoft.com/office/drawing/2016/5/11/chartex" xmlns:cx6="http://schemas.microsoft.com/office/drawing/2016/5/12/chartex" xmlns:cx7="http://schemas.microsoft.com/office/drawing/2016/5/13/chartex" xmlns:cx8="http://schemas.microsoft.com/office/drawing/2016/5/14/chartex" xmlns:mc="http://schemas.openxmlformats.org/markup-compatibility/2006" xmlns:m="http://schemas.openxmlformats.org/officeDocument/2006/math" xmlns:aink="http://schemas.microsoft.com/office/drawing/2016/ink" xmlns:am3d="http://schemas.microsoft.com/office/drawing/2017/model3d" xmlns:oel="http://schemas.microsoft.com/office/2019/extlst" xmlns:r="http://schemas.openxmlformats.org/officeDocument/2006/relationships" xmlns:wp14="http://schemas.microsoft.com/office/word/2010/wordprocessingDrawing" xmlns:wp="http://schemas.openxmlformats.org/drawingml/2006/wordprocessingDrawing" xmlns:wpg="http://schemas.microsoft.com/office/word/2010/wordprocessingGroup" xmlns:wpi="http://schemas.microsoft.com/office/word/2010/wordprocessingInk" xmlns:wps="http://schemas.microsoft.com/office/word/2010/wordprocessingShape" xmlns:o="urn:schemas-microsoft-com:office:office" xmlns:v="urn:schemas-microsoft-com:vml" xmlns:w10="urn:schemas-microsoft-com:office:word" xmlns:w="http://schemas.openxmlformats.org/wordprocessingml/2006/main" xmlns:w14="http://schemas.microsoft.com/office/word/2010/wordml" xmlns:w15="http://schemas.microsoft.com/office/word/2012/wordml" xmlns:w16cex="http://schemas.microsoft.com/office/word/2018/wordml/cex" xmlns:w16cid="http://schemas.microsoft.com/office/word/2016/wordml/cid" xmlns:w16="http://schemas.microsoft.com/office/word/2018/wordml" xmlns:w16sdtdh="http://schemas.microsoft.com/office/word/2020/wordml/sdtdatahash" xmlns:w16sdtfl="http://schemas.microsoft.com/office/word/2024/wordml/sdtformatlock" xmlns:w16se="http://schemas.microsoft.com/office/word/2015/wordml/symex" xmlns:w16du="http://schemas.microsoft.com/office/word/2023/wordml/word16du" xmlns:wne="http://schemas.microsoft.com/office/word/2006/wordml" mc:Ignorable="w14 w15 w16se w16cid w16 w16cex w16sdtdh w16sdtfl w16du wp14">
   <w:abstractNum w:abstractNumId="0" w15:restartNumberingAfterBreak="0">
     <w:nsid w:val="FFFFFF7C"/>
     <w:multiLevelType w:val="singleLevel"/>
@@ -10730,7 +11448,7 @@
 </file>
 
 <file path=word/styles.xml><?xml version="1.0" encoding="utf-8"?>
-<w:styles xmlns:mc="http://schemas.openxmlformats.org/markup-compatibility/2006" xmlns:r="http://schemas.openxmlformats.org/officeDocument/2006/relationships" xmlns:w="http://schemas.openxmlformats.org/wordprocessingml/2006/main" xmlns:w14="http://schemas.microsoft.com/office/word/2010/wordml" xmlns:w15="http://schemas.microsoft.com/office/word/2012/wordml" xmlns:w16cex="http://schemas.microsoft.com/office/word/2018/wordml/cex" xmlns:w16cid="http://schemas.microsoft.com/office/word/2016/wordml/cid" xmlns:w16="http://schemas.microsoft.com/office/word/2018/wordml" xmlns:w16du="http://schemas.microsoft.com/office/word/2023/wordml/word16du" xmlns:w16sdtdh="http://schemas.microsoft.com/office/word/2020/wordml/sdtdatahash" xmlns:w16sdtfl="http://schemas.microsoft.com/office/word/2024/wordml/sdtformatlock" xmlns:w16se="http://schemas.microsoft.com/office/word/2015/wordml/symex" mc:Ignorable="w14 w15 w16se w16cid w16 w16cex w16sdtdh w16sdtfl w16du">
+<w:styles xmlns:mc="http://schemas.openxmlformats.org/markup-compatibility/2006" xmlns:r="http://schemas.openxmlformats.org/officeDocument/2006/relationships" xmlns:w="http://schemas.openxmlformats.org/wordprocessingml/2006/main" xmlns:w14="http://schemas.microsoft.com/office/word/2010/wordml" xmlns:w15="http://schemas.microsoft.com/office/word/2012/wordml" xmlns:w16cex="http://schemas.microsoft.com/office/word/2018/wordml/cex" xmlns:w16cid="http://schemas.microsoft.com/office/word/2016/wordml/cid" xmlns:w16="http://schemas.microsoft.com/office/word/2018/wordml" xmlns:w16sdtdh="http://schemas.microsoft.com/office/word/2020/wordml/sdtdatahash" xmlns:w16sdtfl="http://schemas.microsoft.com/office/word/2024/wordml/sdtformatlock" xmlns:w16se="http://schemas.microsoft.com/office/word/2015/wordml/symex" xmlns:w16du="http://schemas.microsoft.com/office/word/2023/wordml/word16du" mc:Ignorable="w14 w15 w16se w16cid w16 w16cex w16sdtdh w16sdtfl w16du">
   <w:docDefaults>
     <w:rPrDefault>
       <w:rPr>
@@ -22132,6 +22850,50 @@
       <w:sz w:val="18"/>
     </w:rPr>
   </w:style>
+  <w:style w:type="character" w:styleId="HTMLCode">
+    <w:name w:val="HTML Code"/>
+    <w:basedOn w:val="DefaultParagraphFont"/>
+    <w:uiPriority w:val="99"/>
+    <w:semiHidden/>
+    <w:unhideWhenUsed/>
+    <w:rsid w:val="00FA4F95"/>
+    <w:rPr>
+      <w:rFonts w:ascii="Courier New" w:eastAsia="Times New Roman" w:hAnsi="Courier New" w:cs="Courier New"/>
+      <w:sz w:val="20"/>
+      <w:szCs w:val="20"/>
+    </w:rPr>
+  </w:style>
+  <w:style w:type="paragraph" w:customStyle="1" w:styleId="pdq2pgselectionanchorcontainer">
+    <w:name w:val="pdq2pg_selectionanchorcontainer"/>
+    <w:basedOn w:val="Normal"/>
+    <w:rsid w:val="00D31517"/>
+    <w:pPr>
+      <w:spacing w:before="100" w:beforeAutospacing="1" w:after="100" w:afterAutospacing="1" w:line="240" w:lineRule="auto"/>
+    </w:pPr>
+    <w:rPr>
+      <w:rFonts w:ascii="Times New Roman" w:eastAsia="Times New Roman" w:hAnsi="Times New Roman" w:cs="Times New Roman"/>
+      <w:sz w:val="24"/>
+      <w:szCs w:val="24"/>
+      <w:lang w:val="en-GB" w:eastAsia="en-GB"/>
+    </w:rPr>
+  </w:style>
+  <w:style w:type="paragraph" w:styleId="NormalWeb">
+    <w:name w:val="Normal (Web)"/>
+    <w:basedOn w:val="Normal"/>
+    <w:uiPriority w:val="99"/>
+    <w:semiHidden/>
+    <w:unhideWhenUsed/>
+    <w:rsid w:val="00D31517"/>
+    <w:pPr>
+      <w:spacing w:before="100" w:beforeAutospacing="1" w:after="100" w:afterAutospacing="1" w:line="240" w:lineRule="auto"/>
+    </w:pPr>
+    <w:rPr>
+      <w:rFonts w:ascii="Times New Roman" w:eastAsia="Times New Roman" w:hAnsi="Times New Roman" w:cs="Times New Roman"/>
+      <w:sz w:val="24"/>
+      <w:szCs w:val="24"/>
+      <w:lang w:val="en-GB" w:eastAsia="en-GB"/>
+    </w:rPr>
+  </w:style>
 </w:styles>
 </file>
 

</xml_diff>